<commit_message>
Focus CVs on vision, belief research and practical CUDA experience
</commit_message>
<xml_diff>
--- a/public/resumes/Mehrad-Yaghoubi-AI-Engineering-Resume-FA.docx
+++ b/public/resumes/Mehrad-Yaghoubi-AI-Engineering-Resume-FA.docx
@@ -37,7 +37,7 @@
           <w:rtl/>
           <w:lang w:val="fa-IR" w:bidi="fa-IR"/>
         </w:rPr>
-        <w:t>رزومه کاری هوش مصنوعی</w:t>
+        <w:t>متخصص هوش مصنوعی</w:t>
       </w:r>
     </w:p>
     <w:p>
@@ -180,7 +180,7 @@
           <w:rtl/>
           <w:lang w:val="fa-IR" w:bidi="fa-IR"/>
         </w:rPr>
-        <w:t xml:space="preserve">در زمینه توسعه ابزارهای هوش مصنوعی فعالیت می‌کنم و تجربه ساخت چت‌بات فارسی، افزونه‌های </w:t>
+        <w:t xml:space="preserve">چت‌بات فارسی سفر با سه افزونه </w:t>
       </w:r>
       <w:r>
         <w:rPr>
@@ -199,7 +199,7 @@
           <w:rtl/>
           <w:lang w:val="fa-IR" w:bidi="fa-IR"/>
         </w:rPr>
-        <w:t xml:space="preserve"> و ابزار بررسی قیمت دارم. پژوهش کارشناسی ارشد من بر </w:t>
+        <w:t xml:space="preserve"> را توسعه داده‌ام. تجربه پژوهشی و نرم‌افزاری من شامل آموزش و </w:t>
       </w:r>
       <w:r>
         <w:rPr>
@@ -208,7 +208,7 @@
           <w:szCs w:val="21"/>
           <w:lang w:bidi="fa-IR"/>
         </w:rPr>
-        <w:t>VSR</w:t>
+        <w:t>inference</w:t>
       </w:r>
       <w:r>
         <w:rPr>
@@ -218,7 +218,7 @@
           <w:rtl/>
           <w:lang w:val="fa-IR" w:bidi="fa-IR"/>
         </w:rPr>
-        <w:t xml:space="preserve"> و مدل‌های سبک با </w:t>
+        <w:t xml:space="preserve"> مدل‌های </w:t>
       </w:r>
       <w:r>
         <w:rPr>
@@ -227,7 +227,7 @@
           <w:szCs w:val="21"/>
           <w:lang w:bidi="fa-IR"/>
         </w:rPr>
-        <w:t>PyTorch</w:t>
+        <w:t>VSR</w:t>
       </w:r>
       <w:r>
         <w:rPr>
@@ -237,7 +237,45 @@
           <w:rtl/>
           <w:lang w:val="fa-IR" w:bidi="fa-IR"/>
         </w:rPr>
-        <w:t xml:space="preserve"> متمرکز است.</w:t>
+        <w:t xml:space="preserve"> با </w:t>
+      </w:r>
+      <w:r>
+        <w:rPr>
+          <w:rFonts w:ascii="Arial" w:hAnsi="Arial" w:cs="Tahoma"/>
+          <w:color w:val="1B2C3B"/>
+          <w:szCs w:val="21"/>
+          <w:lang w:bidi="fa-IR"/>
+        </w:rPr>
+        <w:t>PyTorch</w:t>
+      </w:r>
+      <w:r>
+        <w:rPr>
+          <w:rFonts w:cs="Tahoma"/>
+          <w:color w:val="1B2C3B"/>
+          <w:szCs w:val="21"/>
+          <w:rtl/>
+          <w:lang w:val="fa-IR" w:bidi="fa-IR"/>
+        </w:rPr>
+        <w:t xml:space="preserve"> و </w:t>
+      </w:r>
+      <w:r>
+        <w:rPr>
+          <w:rFonts w:ascii="Arial" w:hAnsi="Arial" w:cs="Tahoma"/>
+          <w:color w:val="1B2C3B"/>
+          <w:szCs w:val="21"/>
+          <w:lang w:bidi="fa-IR"/>
+        </w:rPr>
+        <w:t>CUDA</w:t>
+      </w:r>
+      <w:r>
+        <w:rPr>
+          <w:rFonts w:cs="Tahoma"/>
+          <w:color w:val="1B2C3B"/>
+          <w:szCs w:val="21"/>
+          <w:rtl/>
+          <w:lang w:val="fa-IR" w:bidi="fa-IR"/>
+        </w:rPr>
+        <w:t xml:space="preserve"> و توسعه یک بسته متن‌باز پردازش ویدئو است.</w:t>
       </w:r>
     </w:p>
     <w:p>
@@ -291,6 +329,25 @@
           <w:lang w:bidi="fa-IR"/>
         </w:rPr>
         <w:t>PyTorch</w:t>
+      </w:r>
+      <w:r>
+        <w:rPr>
+          <w:rFonts w:cs="Tahoma"/>
+          <w:color w:val="1B2C3B"/>
+          <w:szCs w:val="21"/>
+          <w:rtl/>
+          <w:lang w:val="fa-IR" w:bidi="fa-IR"/>
+        </w:rPr>
+        <w:t xml:space="preserve">، </w:t>
+      </w:r>
+      <w:r>
+        <w:rPr>
+          <w:rFonts w:ascii="Arial" w:hAnsi="Arial" w:cs="Tahoma"/>
+          <w:color w:val="1B2C3B"/>
+          <w:szCs w:val="21"/>
+          <w:lang w:bidi="fa-IR"/>
+        </w:rPr>
+        <w:t>CUDA</w:t>
       </w:r>
       <w:r>
         <w:rPr>
@@ -678,7 +735,7 @@
           <w:rtl/>
           <w:lang w:val="fa-IR" w:bidi="fa-IR"/>
         </w:rPr>
-        <w:t>این طرح دانشگاهی بر بازی‌های مبتنی بر روان‌شناسی با هدف کمک به پیشگیری از وقوع جرم متمرکز بود. فعالیت به ثبت رسمی شرکت نرسید.</w:t>
+        <w:t>طرح دانشگاهی بازی‌سازی مبتنی بر روان‌شناسی برای کمک به پیشگیری از جرم. شرکت رسمی ثبت نشد.</w:t>
       </w:r>
     </w:p>
     <w:p>
@@ -707,6 +764,18 @@
       </w:pPr>
       <w:r>
         <w:rPr>
+          <w:rFonts w:cs="Tahoma"/>
+          <w:b/>
+          <w:bCs/>
+          <w:color w:val="1B2C3B"/>
+          <w:szCs w:val="21"/>
+          <w:rtl/>
+          <w:lang w:val="fa-IR" w:bidi="fa-IR"/>
+        </w:rPr>
+        <w:t xml:space="preserve">پژوهش </w:t>
+      </w:r>
+      <w:r>
+        <w:rPr>
           <w:rFonts w:ascii="Arial" w:hAnsi="Arial" w:cs="Tahoma"/>
           <w:b/>
           <w:bCs/>
@@ -714,7 +783,30 @@
           <w:szCs w:val="21"/>
           <w:lang w:bidi="fa-IR"/>
         </w:rPr>
-        <w:t>PyLipExtractor</w:t>
+        <w:t>VSR</w:t>
+      </w:r>
+      <w:r>
+        <w:rPr>
+          <w:rFonts w:cs="Tahoma"/>
+          <w:b/>
+          <w:bCs/>
+          <w:color w:val="1B2C3B"/>
+          <w:szCs w:val="21"/>
+          <w:rtl/>
+          <w:lang w:val="fa-IR" w:bidi="fa-IR"/>
+        </w:rPr>
+        <w:t xml:space="preserve"> با </w:t>
+      </w:r>
+      <w:r>
+        <w:rPr>
+          <w:rFonts w:ascii="Arial" w:hAnsi="Arial" w:cs="Tahoma"/>
+          <w:b/>
+          <w:bCs/>
+          <w:color w:val="1B2C3B"/>
+          <w:szCs w:val="21"/>
+          <w:lang w:bidi="fa-IR"/>
+        </w:rPr>
+        <w:t>EGOSD</w:t>
       </w:r>
       <w:r>
         <w:rPr>
@@ -724,7 +816,7 @@
           <w:rtl/>
           <w:lang w:val="fa-IR" w:bidi="fa-IR"/>
         </w:rPr>
-        <w:t xml:space="preserve"> | بسته </w:t>
+        <w:t xml:space="preserve"> | ماژول داخلی </w:t>
       </w:r>
       <w:r>
         <w:rPr>
@@ -733,7 +825,7 @@
           <w:szCs w:val="21"/>
           <w:lang w:bidi="fa-IR"/>
         </w:rPr>
-        <w:t>Python</w:t>
+        <w:t>belief</w:t>
       </w:r>
       <w:r>
         <w:rPr>
@@ -743,7 +835,122 @@
           <w:rtl/>
           <w:lang w:val="fa-IR" w:bidi="fa-IR"/>
         </w:rPr>
-        <w:t xml:space="preserve"> برای استخراج ناحیه لب از ویدئو با </w:t>
+        <w:t xml:space="preserve"> برای هدایت خودتقطیری بر اساس عدم قطعیت. آموزش و </w:t>
+      </w:r>
+      <w:r>
+        <w:rPr>
+          <w:rFonts w:ascii="Arial" w:hAnsi="Arial" w:cs="Tahoma"/>
+          <w:color w:val="1B2C3B"/>
+          <w:szCs w:val="21"/>
+          <w:lang w:bidi="fa-IR"/>
+        </w:rPr>
+        <w:t>inference</w:t>
+      </w:r>
+      <w:r>
+        <w:rPr>
+          <w:rFonts w:cs="Tahoma"/>
+          <w:color w:val="1B2C3B"/>
+          <w:szCs w:val="21"/>
+          <w:rtl/>
+          <w:lang w:val="fa-IR" w:bidi="fa-IR"/>
+        </w:rPr>
+        <w:t xml:space="preserve"> با </w:t>
+      </w:r>
+      <w:r>
+        <w:rPr>
+          <w:rFonts w:ascii="Arial" w:hAnsi="Arial" w:cs="Tahoma"/>
+          <w:color w:val="1B2C3B"/>
+          <w:szCs w:val="21"/>
+          <w:lang w:bidi="fa-IR"/>
+        </w:rPr>
+        <w:t>PyTorch</w:t>
+      </w:r>
+      <w:r>
+        <w:rPr>
+          <w:rFonts w:cs="Tahoma"/>
+          <w:color w:val="1B2C3B"/>
+          <w:szCs w:val="21"/>
+          <w:rtl/>
+          <w:lang w:val="fa-IR" w:bidi="fa-IR"/>
+        </w:rPr>
+        <w:t xml:space="preserve"> و </w:t>
+      </w:r>
+      <w:r>
+        <w:rPr>
+          <w:rFonts w:ascii="Arial" w:hAnsi="Arial" w:cs="Tahoma"/>
+          <w:color w:val="1B2C3B"/>
+          <w:szCs w:val="21"/>
+          <w:lang w:bidi="fa-IR"/>
+        </w:rPr>
+        <w:t>CUDA.</w:t>
+      </w:r>
+      <w:r>
+        <w:rPr>
+          <w:rFonts w:cs="Tahoma"/>
+          <w:color w:val="1B2C3B"/>
+          <w:szCs w:val="21"/>
+          <w:rtl/>
+          <w:lang w:val="fa-IR" w:bidi="fa-IR"/>
+        </w:rPr>
+        <w:t xml:space="preserve"> در حال داوری در </w:t>
+      </w:r>
+      <w:r>
+        <w:rPr>
+          <w:rFonts w:ascii="Arial" w:hAnsi="Arial" w:cs="Tahoma"/>
+          <w:color w:val="1B2C3B"/>
+          <w:szCs w:val="21"/>
+          <w:lang w:bidi="fa-IR"/>
+        </w:rPr>
+        <w:t>The Visual Computer.</w:t>
+      </w:r>
+    </w:p>
+    <w:p>
+      <w:pPr>
+        <w:keepLines/>
+        <w:bidi/>
+        <w:rPr>
+          <w:rFonts w:hint="eastAsia"/>
+        </w:rPr>
+      </w:pPr>
+      <w:r>
+        <w:rPr>
+          <w:rFonts w:ascii="Arial" w:hAnsi="Arial" w:cs="Tahoma"/>
+          <w:b/>
+          <w:bCs/>
+          <w:color w:val="1B2C3B"/>
+          <w:szCs w:val="21"/>
+          <w:lang w:bidi="fa-IR"/>
+        </w:rPr>
+        <w:t>PyLipExtractor</w:t>
+      </w:r>
+      <w:r>
+        <w:rPr>
+          <w:rFonts w:cs="Tahoma"/>
+          <w:color w:val="1B2C3B"/>
+          <w:szCs w:val="21"/>
+          <w:rtl/>
+          <w:lang w:val="fa-IR" w:bidi="fa-IR"/>
+        </w:rPr>
+        <w:t xml:space="preserve"> | بسته متن‌باز </w:t>
+      </w:r>
+      <w:r>
+        <w:rPr>
+          <w:rFonts w:ascii="Arial" w:hAnsi="Arial" w:cs="Tahoma"/>
+          <w:color w:val="1B2C3B"/>
+          <w:szCs w:val="21"/>
+          <w:lang w:bidi="fa-IR"/>
+        </w:rPr>
+        <w:t>Python</w:t>
+      </w:r>
+      <w:r>
+        <w:rPr>
+          <w:rFonts w:cs="Tahoma"/>
+          <w:color w:val="1B2C3B"/>
+          <w:szCs w:val="21"/>
+          <w:rtl/>
+          <w:lang w:val="fa-IR" w:bidi="fa-IR"/>
+        </w:rPr>
+        <w:t xml:space="preserve"> برای استخراج ناحیه لب با </w:t>
       </w:r>
       <w:r>
         <w:rPr>
@@ -1226,7 +1433,7 @@
           <w:rtl/>
           <w:lang w:val="fa-IR" w:bidi="fa-IR"/>
         </w:rPr>
-        <w:t>پژوهش</w:t>
+        <w:t>پژوهش دیگر</w:t>
       </w:r>
     </w:p>
     <w:p>
@@ -1245,7 +1452,7 @@
           <w:rtl/>
           <w:lang w:val="fa-IR" w:bidi="fa-IR"/>
         </w:rPr>
-        <w:t xml:space="preserve">پژوهش در زمینه </w:t>
+        <w:t xml:space="preserve">تصمیم‌گیری مبتنی بر </w:t>
       </w:r>
       <w:r>
         <w:rPr>
@@ -1254,7 +1461,7 @@
           <w:szCs w:val="21"/>
           <w:lang w:bidi="fa-IR"/>
         </w:rPr>
-        <w:t>VSR</w:t>
+        <w:t>belief</w:t>
       </w:r>
       <w:r>
         <w:rPr>
@@ -1264,7 +1471,7 @@
           <w:rtl/>
           <w:lang w:val="fa-IR" w:bidi="fa-IR"/>
         </w:rPr>
-        <w:t xml:space="preserve">، </w:t>
+        <w:t xml:space="preserve"> و دروازه عدم قطعیت در </w:t>
       </w:r>
       <w:r>
         <w:rPr>
@@ -1273,7 +1480,7 @@
           <w:szCs w:val="21"/>
           <w:lang w:bidi="fa-IR"/>
         </w:rPr>
-        <w:t>inference</w:t>
+        <w:t>Go.</w:t>
       </w:r>
       <w:r>
         <w:rPr>
@@ -1283,7 +1490,7 @@
           <w:rtl/>
           <w:lang w:val="fa-IR" w:bidi="fa-IR"/>
         </w:rPr>
-        <w:t xml:space="preserve"> کارآمد و انتقال دانش. مقاله </w:t>
+        <w:t xml:space="preserve"> پیش‌چاپ در </w:t>
       </w:r>
       <w:r>
         <w:rPr>
@@ -1292,74 +1499,7 @@
           <w:szCs w:val="21"/>
           <w:lang w:bidi="fa-IR"/>
         </w:rPr>
-        <w:t>VSR</w:t>
-      </w:r>
-      <w:r>
-        <w:rPr>
-          <w:rFonts w:cs="Tahoma"/>
-          <w:color w:val="1B2C3B"/>
-          <w:szCs w:val="21"/>
-          <w:rtl/>
-          <w:lang w:val="fa-IR" w:bidi="fa-IR"/>
-        </w:rPr>
-        <w:t xml:space="preserve"> در مجله </w:t>
-      </w:r>
-      <w:r>
-        <w:rPr>
-          <w:rFonts w:ascii="Arial" w:hAnsi="Arial" w:cs="Tahoma"/>
-          <w:color w:val="1B2C3B"/>
-          <w:szCs w:val="21"/>
-          <w:lang w:bidi="fa-IR"/>
-        </w:rPr>
-        <w:t>The Visual Computer</w:t>
-      </w:r>
-      <w:r>
-        <w:rPr>
-          <w:rFonts w:cs="Tahoma"/>
-          <w:color w:val="1B2C3B"/>
-          <w:szCs w:val="21"/>
-          <w:rtl/>
-          <w:lang w:val="fa-IR" w:bidi="fa-IR"/>
-        </w:rPr>
-        <w:t xml:space="preserve"> در حال داوری است. مقاله دوم درباره تصمیم‌گیری در بازی </w:t>
-      </w:r>
-      <w:r>
-        <w:rPr>
-          <w:rFonts w:ascii="Arial" w:hAnsi="Arial" w:cs="Tahoma"/>
-          <w:color w:val="1B2C3B"/>
-          <w:szCs w:val="21"/>
-          <w:lang w:bidi="fa-IR"/>
-        </w:rPr>
-        <w:t>Go</w:t>
-      </w:r>
-      <w:r>
-        <w:rPr>
-          <w:rFonts w:cs="Tahoma"/>
-          <w:color w:val="1B2C3B"/>
-          <w:szCs w:val="21"/>
-          <w:rtl/>
-          <w:lang w:val="fa-IR" w:bidi="fa-IR"/>
-        </w:rPr>
-        <w:t xml:space="preserve"> به صورت پیش‌چاپ در </w:t>
-      </w:r>
-      <w:r>
-        <w:rPr>
-          <w:rFonts w:ascii="Arial" w:hAnsi="Arial" w:cs="Tahoma"/>
-          <w:color w:val="1B2C3B"/>
-          <w:szCs w:val="21"/>
-          <w:lang w:bidi="fa-IR"/>
-        </w:rPr>
-        <w:t>arXiv</w:t>
-      </w:r>
-      <w:r>
-        <w:rPr>
-          <w:rFonts w:cs="Tahoma"/>
-          <w:color w:val="1B2C3B"/>
-          <w:szCs w:val="21"/>
-          <w:rtl/>
-          <w:lang w:val="fa-IR" w:bidi="fa-IR"/>
-        </w:rPr>
-        <w:t xml:space="preserve"> منتشر شده است.</w:t>
+        <w:t>arXiv: arxiv.org/abs/2607.26946.</w:t>
       </w:r>
     </w:p>
     <w:p>
@@ -1726,31 +1866,31 @@
       </w:rPr>
     </w:lvl>
   </w:abstractNum>
-  <w:num w:numId="1" w16cid:durableId="1963924378">
+  <w:num w:numId="1" w16cid:durableId="839927905">
     <w:abstractNumId w:val="8"/>
   </w:num>
-  <w:num w:numId="2" w16cid:durableId="1183477503">
+  <w:num w:numId="2" w16cid:durableId="1194655787">
     <w:abstractNumId w:val="6"/>
   </w:num>
-  <w:num w:numId="3" w16cid:durableId="930820170">
+  <w:num w:numId="3" w16cid:durableId="1540780214">
     <w:abstractNumId w:val="5"/>
   </w:num>
-  <w:num w:numId="4" w16cid:durableId="2043942147">
+  <w:num w:numId="4" w16cid:durableId="1092241529">
     <w:abstractNumId w:val="4"/>
   </w:num>
-  <w:num w:numId="5" w16cid:durableId="1297948100">
+  <w:num w:numId="5" w16cid:durableId="784498018">
     <w:abstractNumId w:val="7"/>
   </w:num>
-  <w:num w:numId="6" w16cid:durableId="1588297603">
+  <w:num w:numId="6" w16cid:durableId="1286888904">
     <w:abstractNumId w:val="3"/>
   </w:num>
-  <w:num w:numId="7" w16cid:durableId="938024813">
+  <w:num w:numId="7" w16cid:durableId="316421525">
     <w:abstractNumId w:val="2"/>
   </w:num>
-  <w:num w:numId="8" w16cid:durableId="1492674103">
+  <w:num w:numId="8" w16cid:durableId="1256130723">
     <w:abstractNumId w:val="1"/>
   </w:num>
-  <w:num w:numId="9" w16cid:durableId="1122650625">
+  <w:num w:numId="9" w16cid:durableId="1434788726">
     <w:abstractNumId w:val="0"/>
   </w:num>
 </w:numbering>

</xml_diff>

<commit_message>
Remove redundant portfolio copy and focus academic and work resumes
</commit_message>
<xml_diff>
--- a/public/resumes/Mehrad-Yaghoubi-AI-Engineering-Resume-FA.docx
+++ b/public/resumes/Mehrad-Yaghoubi-AI-Engineering-Resume-FA.docx
@@ -42,7 +42,6 @@
     </w:p>
     <w:p>
       <w:pPr>
-        <w:bidi/>
         <w:rPr>
           <w:rFonts w:hint="eastAsia"/>
         </w:rPr>
@@ -89,7 +88,6 @@
     </w:p>
     <w:p>
       <w:pPr>
-        <w:bidi/>
         <w:spacing w:after="60"/>
         <w:rPr>
           <w:rFonts w:hint="eastAsia"/>
@@ -180,102 +178,7 @@
           <w:rtl/>
           <w:lang w:val="fa-IR" w:bidi="fa-IR"/>
         </w:rPr>
-        <w:t xml:space="preserve">چت‌بات فارسی سفر با سه افزونه </w:t>
-      </w:r>
-      <w:r>
-        <w:rPr>
-          <w:rFonts w:ascii="Arial" w:hAnsi="Arial" w:cs="Tahoma"/>
-          <w:color w:val="1B2C3B"/>
-          <w:szCs w:val="21"/>
-          <w:lang w:bidi="fa-IR"/>
-        </w:rPr>
-        <w:t>WordPress</w:t>
-      </w:r>
-      <w:r>
-        <w:rPr>
-          <w:rFonts w:cs="Tahoma"/>
-          <w:color w:val="1B2C3B"/>
-          <w:szCs w:val="21"/>
-          <w:rtl/>
-          <w:lang w:val="fa-IR" w:bidi="fa-IR"/>
-        </w:rPr>
-        <w:t xml:space="preserve"> را توسعه داده‌ام. تجربه پژوهشی و نرم‌افزاری من شامل آموزش و </w:t>
-      </w:r>
-      <w:r>
-        <w:rPr>
-          <w:rFonts w:ascii="Arial" w:hAnsi="Arial" w:cs="Tahoma"/>
-          <w:color w:val="1B2C3B"/>
-          <w:szCs w:val="21"/>
-          <w:lang w:bidi="fa-IR"/>
-        </w:rPr>
-        <w:t>inference</w:t>
-      </w:r>
-      <w:r>
-        <w:rPr>
-          <w:rFonts w:cs="Tahoma"/>
-          <w:color w:val="1B2C3B"/>
-          <w:szCs w:val="21"/>
-          <w:rtl/>
-          <w:lang w:val="fa-IR" w:bidi="fa-IR"/>
-        </w:rPr>
-        <w:t xml:space="preserve"> مدل‌های </w:t>
-      </w:r>
-      <w:r>
-        <w:rPr>
-          <w:rFonts w:ascii="Arial" w:hAnsi="Arial" w:cs="Tahoma"/>
-          <w:color w:val="1B2C3B"/>
-          <w:szCs w:val="21"/>
-          <w:lang w:bidi="fa-IR"/>
-        </w:rPr>
-        <w:t>VSR</w:t>
-      </w:r>
-      <w:r>
-        <w:rPr>
-          <w:rFonts w:cs="Tahoma"/>
-          <w:color w:val="1B2C3B"/>
-          <w:szCs w:val="21"/>
-          <w:rtl/>
-          <w:lang w:val="fa-IR" w:bidi="fa-IR"/>
-        </w:rPr>
-        <w:t xml:space="preserve"> با </w:t>
-      </w:r>
-      <w:r>
-        <w:rPr>
-          <w:rFonts w:ascii="Arial" w:hAnsi="Arial" w:cs="Tahoma"/>
-          <w:color w:val="1B2C3B"/>
-          <w:szCs w:val="21"/>
-          <w:lang w:bidi="fa-IR"/>
-        </w:rPr>
-        <w:t>PyTorch</w:t>
-      </w:r>
-      <w:r>
-        <w:rPr>
-          <w:rFonts w:cs="Tahoma"/>
-          <w:color w:val="1B2C3B"/>
-          <w:szCs w:val="21"/>
-          <w:rtl/>
-          <w:lang w:val="fa-IR" w:bidi="fa-IR"/>
-        </w:rPr>
-        <w:t xml:space="preserve"> و </w:t>
-      </w:r>
-      <w:r>
-        <w:rPr>
-          <w:rFonts w:ascii="Arial" w:hAnsi="Arial" w:cs="Tahoma"/>
-          <w:color w:val="1B2C3B"/>
-          <w:szCs w:val="21"/>
-          <w:lang w:bidi="fa-IR"/>
-        </w:rPr>
-        <w:t>CUDA</w:t>
-      </w:r>
-      <w:r>
-        <w:rPr>
-          <w:rFonts w:cs="Tahoma"/>
-          <w:color w:val="1B2C3B"/>
-          <w:szCs w:val="21"/>
-          <w:rtl/>
-          <w:lang w:val="fa-IR" w:bidi="fa-IR"/>
-        </w:rPr>
-        <w:t xml:space="preserve"> و توسعه یک بسته متن‌باز پردازش ویدئو است.</w:t>
+        <w:t>متخصص هوش مصنوعی با تجربه توسعه چت‌بات، اتصال سرویس‌های هوش مصنوعی به وب و پژوهش در بازشناسی گفتار دیداری.</w:t>
       </w:r>
     </w:p>
     <w:p>
@@ -297,266 +200,17 @@
     <w:p>
       <w:pPr>
         <w:keepLines/>
-        <w:bidi/>
         <w:rPr>
           <w:rFonts w:hint="eastAsia"/>
         </w:rPr>
       </w:pPr>
       <w:r>
         <w:rPr>
-          <w:rFonts w:ascii="Arial" w:hAnsi="Arial" w:cs="Tahoma"/>
+          <w:rFonts w:ascii="Arial" w:hAnsi="Arial" w:cs="Arial"/>
           <w:color w:val="1B2C3B"/>
-          <w:szCs w:val="21"/>
-          <w:lang w:bidi="fa-IR"/>
+          <w:lang w:bidi="en-US"/>
         </w:rPr>
-        <w:t>Python</w:t>
-      </w:r>
-      <w:r>
-        <w:rPr>
-          <w:rFonts w:cs="Tahoma"/>
-          <w:color w:val="1B2C3B"/>
-          <w:szCs w:val="21"/>
-          <w:rtl/>
-          <w:lang w:val="fa-IR" w:bidi="fa-IR"/>
-        </w:rPr>
-        <w:t xml:space="preserve">، </w:t>
-      </w:r>
-      <w:r>
-        <w:rPr>
-          <w:rFonts w:ascii="Arial" w:hAnsi="Arial" w:cs="Tahoma"/>
-          <w:color w:val="1B2C3B"/>
-          <w:szCs w:val="21"/>
-          <w:lang w:bidi="fa-IR"/>
-        </w:rPr>
-        <w:t>PyTorch</w:t>
-      </w:r>
-      <w:r>
-        <w:rPr>
-          <w:rFonts w:cs="Tahoma"/>
-          <w:color w:val="1B2C3B"/>
-          <w:szCs w:val="21"/>
-          <w:rtl/>
-          <w:lang w:val="fa-IR" w:bidi="fa-IR"/>
-        </w:rPr>
-        <w:t xml:space="preserve">، </w:t>
-      </w:r>
-      <w:r>
-        <w:rPr>
-          <w:rFonts w:ascii="Arial" w:hAnsi="Arial" w:cs="Tahoma"/>
-          <w:color w:val="1B2C3B"/>
-          <w:szCs w:val="21"/>
-          <w:lang w:bidi="fa-IR"/>
-        </w:rPr>
-        <w:t>CUDA</w:t>
-      </w:r>
-      <w:r>
-        <w:rPr>
-          <w:rFonts w:cs="Tahoma"/>
-          <w:color w:val="1B2C3B"/>
-          <w:szCs w:val="21"/>
-          <w:rtl/>
-          <w:lang w:val="fa-IR" w:bidi="fa-IR"/>
-        </w:rPr>
-        <w:t xml:space="preserve">، </w:t>
-      </w:r>
-      <w:r>
-        <w:rPr>
-          <w:rFonts w:ascii="Arial" w:hAnsi="Arial" w:cs="Tahoma"/>
-          <w:color w:val="1B2C3B"/>
-          <w:szCs w:val="21"/>
-          <w:lang w:bidi="fa-IR"/>
-        </w:rPr>
-        <w:t>TorchVision</w:t>
-      </w:r>
-      <w:r>
-        <w:rPr>
-          <w:rFonts w:cs="Tahoma"/>
-          <w:color w:val="1B2C3B"/>
-          <w:szCs w:val="21"/>
-          <w:rtl/>
-          <w:lang w:val="fa-IR" w:bidi="fa-IR"/>
-        </w:rPr>
-        <w:t xml:space="preserve">، </w:t>
-      </w:r>
-      <w:r>
-        <w:rPr>
-          <w:rFonts w:ascii="Arial" w:hAnsi="Arial" w:cs="Tahoma"/>
-          <w:color w:val="1B2C3B"/>
-          <w:szCs w:val="21"/>
-          <w:lang w:bidi="fa-IR"/>
-        </w:rPr>
-        <w:t>OpenCV</w:t>
-      </w:r>
-      <w:r>
-        <w:rPr>
-          <w:rFonts w:cs="Tahoma"/>
-          <w:color w:val="1B2C3B"/>
-          <w:szCs w:val="21"/>
-          <w:rtl/>
-          <w:lang w:val="fa-IR" w:bidi="fa-IR"/>
-        </w:rPr>
-        <w:t xml:space="preserve">، </w:t>
-      </w:r>
-      <w:r>
-        <w:rPr>
-          <w:rFonts w:ascii="Arial" w:hAnsi="Arial" w:cs="Tahoma"/>
-          <w:color w:val="1B2C3B"/>
-          <w:szCs w:val="21"/>
-          <w:lang w:bidi="fa-IR"/>
-        </w:rPr>
-        <w:t>MediaPipe</w:t>
-      </w:r>
-      <w:r>
-        <w:rPr>
-          <w:rFonts w:cs="Tahoma"/>
-          <w:color w:val="1B2C3B"/>
-          <w:szCs w:val="21"/>
-          <w:rtl/>
-          <w:lang w:val="fa-IR" w:bidi="fa-IR"/>
-        </w:rPr>
-        <w:t xml:space="preserve">، </w:t>
-      </w:r>
-      <w:r>
-        <w:rPr>
-          <w:rFonts w:ascii="Arial" w:hAnsi="Arial" w:cs="Tahoma"/>
-          <w:color w:val="1B2C3B"/>
-          <w:szCs w:val="21"/>
-          <w:lang w:bidi="fa-IR"/>
-        </w:rPr>
-        <w:t>NumPy</w:t>
-      </w:r>
-      <w:r>
-        <w:rPr>
-          <w:rFonts w:cs="Tahoma"/>
-          <w:color w:val="1B2C3B"/>
-          <w:szCs w:val="21"/>
-          <w:rtl/>
-          <w:lang w:val="fa-IR" w:bidi="fa-IR"/>
-        </w:rPr>
-        <w:t xml:space="preserve">، </w:t>
-      </w:r>
-      <w:r>
-        <w:rPr>
-          <w:rFonts w:ascii="Arial" w:hAnsi="Arial" w:cs="Tahoma"/>
-          <w:color w:val="1B2C3B"/>
-          <w:szCs w:val="21"/>
-          <w:lang w:bidi="fa-IR"/>
-        </w:rPr>
-        <w:t>Pandas</w:t>
-      </w:r>
-      <w:r>
-        <w:rPr>
-          <w:rFonts w:cs="Tahoma"/>
-          <w:color w:val="1B2C3B"/>
-          <w:szCs w:val="21"/>
-          <w:rtl/>
-          <w:lang w:val="fa-IR" w:bidi="fa-IR"/>
-        </w:rPr>
-        <w:t xml:space="preserve">، </w:t>
-      </w:r>
-      <w:r>
-        <w:rPr>
-          <w:rFonts w:ascii="Arial" w:hAnsi="Arial" w:cs="Tahoma"/>
-          <w:color w:val="1B2C3B"/>
-          <w:szCs w:val="21"/>
-          <w:lang w:bidi="fa-IR"/>
-        </w:rPr>
-        <w:t>scikit-learn</w:t>
-      </w:r>
-      <w:r>
-        <w:rPr>
-          <w:rFonts w:cs="Tahoma"/>
-          <w:color w:val="1B2C3B"/>
-          <w:szCs w:val="21"/>
-          <w:rtl/>
-          <w:lang w:val="fa-IR" w:bidi="fa-IR"/>
-        </w:rPr>
-        <w:t xml:space="preserve">، </w:t>
-      </w:r>
-      <w:r>
-        <w:rPr>
-          <w:rFonts w:ascii="Arial" w:hAnsi="Arial" w:cs="Tahoma"/>
-          <w:color w:val="1B2C3B"/>
-          <w:szCs w:val="21"/>
-          <w:lang w:bidi="fa-IR"/>
-        </w:rPr>
-        <w:t>Git</w:t>
-      </w:r>
-      <w:r>
-        <w:rPr>
-          <w:rFonts w:cs="Tahoma"/>
-          <w:color w:val="1B2C3B"/>
-          <w:szCs w:val="21"/>
-          <w:rtl/>
-          <w:lang w:val="fa-IR" w:bidi="fa-IR"/>
-        </w:rPr>
-        <w:t xml:space="preserve">، </w:t>
-      </w:r>
-      <w:r>
-        <w:rPr>
-          <w:rFonts w:ascii="Arial" w:hAnsi="Arial" w:cs="Tahoma"/>
-          <w:color w:val="1B2C3B"/>
-          <w:szCs w:val="21"/>
-          <w:lang w:bidi="fa-IR"/>
-        </w:rPr>
-        <w:t>Linux</w:t>
-      </w:r>
-      <w:r>
-        <w:rPr>
-          <w:rFonts w:cs="Tahoma"/>
-          <w:color w:val="1B2C3B"/>
-          <w:szCs w:val="21"/>
-          <w:rtl/>
-          <w:lang w:val="fa-IR" w:bidi="fa-IR"/>
-        </w:rPr>
-        <w:t xml:space="preserve">، </w:t>
-      </w:r>
-      <w:r>
-        <w:rPr>
-          <w:rFonts w:ascii="Arial" w:hAnsi="Arial" w:cs="Tahoma"/>
-          <w:color w:val="1B2C3B"/>
-          <w:szCs w:val="21"/>
-          <w:lang w:bidi="fa-IR"/>
-        </w:rPr>
-        <w:t>FastAPI</w:t>
-      </w:r>
-      <w:r>
-        <w:rPr>
-          <w:rFonts w:cs="Tahoma"/>
-          <w:color w:val="1B2C3B"/>
-          <w:szCs w:val="21"/>
-          <w:rtl/>
-          <w:lang w:val="fa-IR" w:bidi="fa-IR"/>
-        </w:rPr>
-        <w:t xml:space="preserve">، </w:t>
-      </w:r>
-      <w:r>
-        <w:rPr>
-          <w:rFonts w:ascii="Arial" w:hAnsi="Arial" w:cs="Tahoma"/>
-          <w:color w:val="1B2C3B"/>
-          <w:szCs w:val="21"/>
-          <w:lang w:bidi="fa-IR"/>
-        </w:rPr>
-        <w:t>REST APIs</w:t>
-      </w:r>
-      <w:r>
-        <w:rPr>
-          <w:rFonts w:cs="Tahoma"/>
-          <w:color w:val="1B2C3B"/>
-          <w:szCs w:val="21"/>
-          <w:rtl/>
-          <w:lang w:val="fa-IR" w:bidi="fa-IR"/>
-        </w:rPr>
-        <w:t xml:space="preserve">، </w:t>
-      </w:r>
-      <w:r>
-        <w:rPr>
-          <w:rFonts w:ascii="Arial" w:hAnsi="Arial" w:cs="Tahoma"/>
-          <w:color w:val="1B2C3B"/>
-          <w:szCs w:val="21"/>
-          <w:lang w:bidi="fa-IR"/>
-        </w:rPr>
-        <w:t>WordPress</w:t>
+        <w:t>Python, PyTorch (CUDA), OpenCV, MediaPipe, FastAPI, REST APIs, WordPress, Git, Linux</w:t>
       </w:r>
     </w:p>
     <w:p>
@@ -735,7 +389,7 @@
           <w:rtl/>
           <w:lang w:val="fa-IR" w:bidi="fa-IR"/>
         </w:rPr>
-        <w:t>طرح دانشگاهی بازی‌سازی مبتنی بر روان‌شناسی برای کمک به پیشگیری از جرم. شرکت رسمی ثبت نشد.</w:t>
+        <w:t>طرح استارتاپی دانشگاهی برای توسعه بازی‌های مبتنی بر روان‌شناسی با هدف کمک به پیشگیری از جرم. این طرح به ثبت شرکت نرسید.</w:t>
       </w:r>
     </w:p>
     <w:p>
@@ -764,41 +418,6 @@
       </w:pPr>
       <w:r>
         <w:rPr>
-          <w:rFonts w:cs="Tahoma"/>
-          <w:b/>
-          <w:bCs/>
-          <w:color w:val="1B2C3B"/>
-          <w:szCs w:val="21"/>
-          <w:rtl/>
-          <w:lang w:val="fa-IR" w:bidi="fa-IR"/>
-        </w:rPr>
-        <w:t xml:space="preserve">پژوهش </w:t>
-      </w:r>
-      <w:r>
-        <w:rPr>
-          <w:rFonts w:ascii="Arial" w:hAnsi="Arial" w:cs="Tahoma"/>
-          <w:b/>
-          <w:bCs/>
-          <w:color w:val="1B2C3B"/>
-          <w:szCs w:val="21"/>
-          <w:lang w:bidi="fa-IR"/>
-        </w:rPr>
-        <w:t>VSR</w:t>
-      </w:r>
-      <w:r>
-        <w:rPr>
-          <w:rFonts w:cs="Tahoma"/>
-          <w:b/>
-          <w:bCs/>
-          <w:color w:val="1B2C3B"/>
-          <w:szCs w:val="21"/>
-          <w:rtl/>
-          <w:lang w:val="fa-IR" w:bidi="fa-IR"/>
-        </w:rPr>
-        <w:t xml:space="preserve"> با </w:t>
-      </w:r>
-      <w:r>
-        <w:rPr>
           <w:rFonts w:ascii="Arial" w:hAnsi="Arial" w:cs="Tahoma"/>
           <w:b/>
           <w:bCs/>
@@ -816,7 +435,7 @@
           <w:rtl/>
           <w:lang w:val="fa-IR" w:bidi="fa-IR"/>
         </w:rPr>
-        <w:t xml:space="preserve"> | ماژول داخلی </w:t>
+        <w:t xml:space="preserve"> | خودتقطیری مبتنی بر عدم قطعیت برای </w:t>
       </w:r>
       <w:r>
         <w:rPr>
@@ -825,7 +444,7 @@
           <w:szCs w:val="21"/>
           <w:lang w:bidi="fa-IR"/>
         </w:rPr>
-        <w:t>belief</w:t>
+        <w:t>VSR.</w:t>
       </w:r>
       <w:r>
         <w:rPr>
@@ -835,7 +454,7 @@
           <w:rtl/>
           <w:lang w:val="fa-IR" w:bidi="fa-IR"/>
         </w:rPr>
-        <w:t xml:space="preserve"> برای هدایت خودتقطیری بر اساس عدم قطعیت. آموزش و </w:t>
+        <w:t xml:space="preserve"> آموزش و اجرای مدل روی </w:t>
       </w:r>
       <w:r>
         <w:rPr>
@@ -844,45 +463,7 @@
           <w:szCs w:val="21"/>
           <w:lang w:bidi="fa-IR"/>
         </w:rPr>
-        <w:t>inference</w:t>
-      </w:r>
-      <w:r>
-        <w:rPr>
-          <w:rFonts w:cs="Tahoma"/>
-          <w:color w:val="1B2C3B"/>
-          <w:szCs w:val="21"/>
-          <w:rtl/>
-          <w:lang w:val="fa-IR" w:bidi="fa-IR"/>
-        </w:rPr>
-        <w:t xml:space="preserve"> با </w:t>
-      </w:r>
-      <w:r>
-        <w:rPr>
-          <w:rFonts w:ascii="Arial" w:hAnsi="Arial" w:cs="Tahoma"/>
-          <w:color w:val="1B2C3B"/>
-          <w:szCs w:val="21"/>
-          <w:lang w:bidi="fa-IR"/>
-        </w:rPr>
-        <w:t>PyTorch</w:t>
-      </w:r>
-      <w:r>
-        <w:rPr>
-          <w:rFonts w:cs="Tahoma"/>
-          <w:color w:val="1B2C3B"/>
-          <w:szCs w:val="21"/>
-          <w:rtl/>
-          <w:lang w:val="fa-IR" w:bidi="fa-IR"/>
-        </w:rPr>
-        <w:t xml:space="preserve"> و </w:t>
-      </w:r>
-      <w:r>
-        <w:rPr>
-          <w:rFonts w:ascii="Arial" w:hAnsi="Arial" w:cs="Tahoma"/>
-          <w:color w:val="1B2C3B"/>
-          <w:szCs w:val="21"/>
-          <w:lang w:bidi="fa-IR"/>
-        </w:rPr>
-        <w:t>CUDA.</w:t>
+        <w:t>GPU.</w:t>
       </w:r>
       <w:r>
         <w:rPr>
@@ -931,8 +512,16 @@
           <w:rtl/>
           <w:lang w:val="fa-IR" w:bidi="fa-IR"/>
         </w:rPr>
-        <w:t xml:space="preserve"> | بسته متن‌باز </w:t>
+        <w:t xml:space="preserve"> | بسته متن‌باز استخراج ناحیه لب از ویدئو با هموارسازی زمانی و تنظیم اختیاری روشنایی.</w:t>
       </w:r>
+    </w:p>
+    <w:p>
+      <w:pPr>
+        <w:keepLines/>
+        <w:rPr>
+          <w:rFonts w:hint="eastAsia"/>
+        </w:rPr>
+      </w:pPr>
       <w:r>
         <w:rPr>
           <w:rFonts w:ascii="Arial" w:hAnsi="Arial" w:cs="Tahoma"/>
@@ -940,64 +529,7 @@
           <w:szCs w:val="21"/>
           <w:lang w:bidi="fa-IR"/>
         </w:rPr>
-        <w:t>Python</w:t>
-      </w:r>
-      <w:r>
-        <w:rPr>
-          <w:rFonts w:cs="Tahoma"/>
-          <w:color w:val="1B2C3B"/>
-          <w:szCs w:val="21"/>
-          <w:rtl/>
-          <w:lang w:val="fa-IR" w:bidi="fa-IR"/>
-        </w:rPr>
-        <w:t xml:space="preserve"> برای استخراج ناحیه لب با </w:t>
-      </w:r>
-      <w:r>
-        <w:rPr>
-          <w:rFonts w:ascii="Arial" w:hAnsi="Arial" w:cs="Tahoma"/>
-          <w:color w:val="1B2C3B"/>
-          <w:szCs w:val="21"/>
-          <w:lang w:bidi="fa-IR"/>
-        </w:rPr>
-        <w:t>MediaPipe</w:t>
-      </w:r>
-      <w:r>
-        <w:rPr>
-          <w:rFonts w:cs="Tahoma"/>
-          <w:color w:val="1B2C3B"/>
-          <w:szCs w:val="21"/>
-          <w:rtl/>
-          <w:lang w:val="fa-IR" w:bidi="fa-IR"/>
-        </w:rPr>
-        <w:t xml:space="preserve">، هموارسازی زمانی و پردازش قابل تنظیم با </w:t>
-      </w:r>
-      <w:r>
-        <w:rPr>
-          <w:rFonts w:ascii="Arial" w:hAnsi="Arial" w:cs="Tahoma"/>
-          <w:color w:val="1B2C3B"/>
-          <w:szCs w:val="21"/>
-          <w:lang w:bidi="fa-IR"/>
-        </w:rPr>
-        <w:t>CPU</w:t>
-      </w:r>
-      <w:r>
-        <w:rPr>
-          <w:rFonts w:cs="Tahoma"/>
-          <w:color w:val="1B2C3B"/>
-          <w:szCs w:val="21"/>
-          <w:rtl/>
-          <w:lang w:val="fa-IR" w:bidi="fa-IR"/>
-        </w:rPr>
-        <w:t xml:space="preserve"> یا </w:t>
-      </w:r>
-      <w:r>
-        <w:rPr>
-          <w:rFonts w:ascii="Arial" w:hAnsi="Arial" w:cs="Tahoma"/>
-          <w:color w:val="1B2C3B"/>
-          <w:szCs w:val="21"/>
-          <w:lang w:bidi="fa-IR"/>
-        </w:rPr>
-        <w:t>CUDA.</w:t>
+        <w:t>https://github.com/MehradYaghoubi/pylipextractor</w:t>
       </w:r>
     </w:p>
     <w:p>
@@ -1010,12 +542,25 @@
       </w:pPr>
       <w:r>
         <w:rPr>
-          <w:rFonts w:ascii="Arial" w:hAnsi="Arial" w:cs="Tahoma"/>
+          <w:rFonts w:cs="Tahoma"/>
+          <w:b/>
+          <w:bCs/>
           <w:color w:val="1B2C3B"/>
           <w:szCs w:val="21"/>
-          <w:lang w:bidi="fa-IR"/>
+          <w:rtl/>
+          <w:lang w:val="fa-IR" w:bidi="fa-IR"/>
         </w:rPr>
-        <w:t>https://github.com/MehradYaghoubi/pylipextractor</w:t>
+        <w:t>شوفاژ یعقوبی</w:t>
+      </w:r>
+      <w:r>
+        <w:rPr>
+          <w:rFonts w:cs="Tahoma"/>
+          <w:color w:val="1B2C3B"/>
+          <w:szCs w:val="21"/>
+          <w:rtl/>
+          <w:lang w:val="fa-IR" w:bidi="fa-IR"/>
+        </w:rPr>
+        <w:t xml:space="preserve"> | توسعه وب‌سایت خدماتی و فروشگاهی در زمینه تجهیزات گرمایشی.</w:t>
       </w:r>
     </w:p>
     <w:p>
@@ -1057,7 +602,7 @@
           <w:rtl/>
           <w:lang w:val="fa-IR" w:bidi="fa-IR"/>
         </w:rPr>
-        <w:t xml:space="preserve"> | توسعه ابزار تشخیص متن با استفاده از یک </w:t>
+        <w:t xml:space="preserve"> | تشخیص متن با استفاده از یک </w:t>
       </w:r>
       <w:r>
         <w:rPr>
@@ -1433,88 +978,6 @@
           <w:rtl/>
           <w:lang w:val="fa-IR" w:bidi="fa-IR"/>
         </w:rPr>
-        <w:t>پژوهش دیگر</w:t>
-      </w:r>
-    </w:p>
-    <w:p>
-      <w:pPr>
-        <w:keepLines/>
-        <w:bidi/>
-        <w:rPr>
-          <w:rFonts w:hint="eastAsia"/>
-        </w:rPr>
-      </w:pPr>
-      <w:r>
-        <w:rPr>
-          <w:rFonts w:cs="Tahoma"/>
-          <w:color w:val="1B2C3B"/>
-          <w:szCs w:val="21"/>
-          <w:rtl/>
-          <w:lang w:val="fa-IR" w:bidi="fa-IR"/>
-        </w:rPr>
-        <w:t xml:space="preserve">تصمیم‌گیری مبتنی بر </w:t>
-      </w:r>
-      <w:r>
-        <w:rPr>
-          <w:rFonts w:ascii="Arial" w:hAnsi="Arial" w:cs="Tahoma"/>
-          <w:color w:val="1B2C3B"/>
-          <w:szCs w:val="21"/>
-          <w:lang w:bidi="fa-IR"/>
-        </w:rPr>
-        <w:t>belief</w:t>
-      </w:r>
-      <w:r>
-        <w:rPr>
-          <w:rFonts w:cs="Tahoma"/>
-          <w:color w:val="1B2C3B"/>
-          <w:szCs w:val="21"/>
-          <w:rtl/>
-          <w:lang w:val="fa-IR" w:bidi="fa-IR"/>
-        </w:rPr>
-        <w:t xml:space="preserve"> و دروازه عدم قطعیت در </w:t>
-      </w:r>
-      <w:r>
-        <w:rPr>
-          <w:rFonts w:ascii="Arial" w:hAnsi="Arial" w:cs="Tahoma"/>
-          <w:color w:val="1B2C3B"/>
-          <w:szCs w:val="21"/>
-          <w:lang w:bidi="fa-IR"/>
-        </w:rPr>
-        <w:t>Go.</w:t>
-      </w:r>
-      <w:r>
-        <w:rPr>
-          <w:rFonts w:cs="Tahoma"/>
-          <w:color w:val="1B2C3B"/>
-          <w:szCs w:val="21"/>
-          <w:rtl/>
-          <w:lang w:val="fa-IR" w:bidi="fa-IR"/>
-        </w:rPr>
-        <w:t xml:space="preserve"> پیش‌چاپ در </w:t>
-      </w:r>
-      <w:r>
-        <w:rPr>
-          <w:rFonts w:ascii="Arial" w:hAnsi="Arial" w:cs="Tahoma"/>
-          <w:color w:val="1B2C3B"/>
-          <w:szCs w:val="21"/>
-          <w:lang w:bidi="fa-IR"/>
-        </w:rPr>
-        <w:t>arXiv: arxiv.org/abs/2607.26946.</w:t>
-      </w:r>
-    </w:p>
-    <w:p>
-      <w:pPr>
-        <w:pStyle w:val="Heading1"/>
-        <w:bidi/>
-      </w:pPr>
-      <w:r>
-        <w:rPr>
-          <w:rFonts w:ascii="Tahoma" w:hAnsi="Tahoma" w:cs="Tahoma"/>
-          <w:color w:val="1B2C3B"/>
-          <w:szCs w:val="23"/>
-          <w:rtl/>
-          <w:lang w:val="fa-IR" w:bidi="fa-IR"/>
-        </w:rPr>
         <w:t>زبان‌ها</w:t>
       </w:r>
     </w:p>
@@ -1866,31 +1329,31 @@
       </w:rPr>
     </w:lvl>
   </w:abstractNum>
-  <w:num w:numId="1" w16cid:durableId="839927905">
+  <w:num w:numId="1" w16cid:durableId="139923737">
     <w:abstractNumId w:val="8"/>
   </w:num>
-  <w:num w:numId="2" w16cid:durableId="1194655787">
+  <w:num w:numId="2" w16cid:durableId="385374936">
     <w:abstractNumId w:val="6"/>
   </w:num>
-  <w:num w:numId="3" w16cid:durableId="1540780214">
+  <w:num w:numId="3" w16cid:durableId="274292403">
     <w:abstractNumId w:val="5"/>
   </w:num>
-  <w:num w:numId="4" w16cid:durableId="1092241529">
+  <w:num w:numId="4" w16cid:durableId="2122410876">
     <w:abstractNumId w:val="4"/>
   </w:num>
-  <w:num w:numId="5" w16cid:durableId="784498018">
+  <w:num w:numId="5" w16cid:durableId="1029331175">
     <w:abstractNumId w:val="7"/>
   </w:num>
-  <w:num w:numId="6" w16cid:durableId="1286888904">
+  <w:num w:numId="6" w16cid:durableId="758453668">
     <w:abstractNumId w:val="3"/>
   </w:num>
-  <w:num w:numId="7" w16cid:durableId="316421525">
+  <w:num w:numId="7" w16cid:durableId="217908155">
     <w:abstractNumId w:val="2"/>
   </w:num>
-  <w:num w:numId="8" w16cid:durableId="1256130723">
+  <w:num w:numId="8" w16cid:durableId="155460416">
     <w:abstractNumId w:val="1"/>
   </w:num>
-  <w:num w:numId="9" w16cid:durableId="1434788726">
+  <w:num w:numId="9" w16cid:durableId="468742561">
     <w:abstractNumId w:val="0"/>
   </w:num>
 </w:numbering>

</xml_diff>

<commit_message>
Add contact phone number to web and downloadable resumes
</commit_message>
<xml_diff>
--- a/public/resumes/Mehrad-Yaghoubi-AI-Engineering-Resume-FA.docx
+++ b/public/resumes/Mehrad-Yaghoubi-AI-Engineering-Resume-FA.docx
@@ -84,6 +84,15 @@
           <w:lang w:bidi="fa-IR"/>
         </w:rPr>
         <w:t>mehradyaghoubi96@gmail.com</w:t>
+      </w:r>
+      <w:r>
+        <w:rPr>
+          <w:rFonts w:ascii="Arial" w:hAnsi="Arial" w:cs="Arial"/>
+          <w:color w:val="1B2C3B"/>
+          <w:sz w:val="17"/>
+          <w:lang w:bidi="en-US"/>
+        </w:rPr>
+        <w:t xml:space="preserve"> | 09912093038</w:t>
       </w:r>
     </w:p>
     <w:p>
@@ -1329,31 +1338,31 @@
       </w:rPr>
     </w:lvl>
   </w:abstractNum>
-  <w:num w:numId="1" w16cid:durableId="139923737">
+  <w:num w:numId="1" w16cid:durableId="208491475">
     <w:abstractNumId w:val="8"/>
   </w:num>
-  <w:num w:numId="2" w16cid:durableId="385374936">
+  <w:num w:numId="2" w16cid:durableId="1317339583">
     <w:abstractNumId w:val="6"/>
   </w:num>
-  <w:num w:numId="3" w16cid:durableId="274292403">
+  <w:num w:numId="3" w16cid:durableId="717978265">
     <w:abstractNumId w:val="5"/>
   </w:num>
-  <w:num w:numId="4" w16cid:durableId="2122410876">
+  <w:num w:numId="4" w16cid:durableId="686448380">
     <w:abstractNumId w:val="4"/>
   </w:num>
-  <w:num w:numId="5" w16cid:durableId="1029331175">
+  <w:num w:numId="5" w16cid:durableId="31347204">
     <w:abstractNumId w:val="7"/>
   </w:num>
-  <w:num w:numId="6" w16cid:durableId="758453668">
+  <w:num w:numId="6" w16cid:durableId="51512331">
     <w:abstractNumId w:val="3"/>
   </w:num>
-  <w:num w:numId="7" w16cid:durableId="217908155">
+  <w:num w:numId="7" w16cid:durableId="1734549343">
     <w:abstractNumId w:val="2"/>
   </w:num>
-  <w:num w:numId="8" w16cid:durableId="155460416">
+  <w:num w:numId="8" w16cid:durableId="1333144396">
     <w:abstractNumId w:val="1"/>
   </w:num>
-  <w:num w:numId="9" w16cid:durableId="468742561">
+  <w:num w:numId="9" w16cid:durableId="431171495">
     <w:abstractNumId w:val="0"/>
   </w:num>
 </w:numbering>

</xml_diff>

<commit_message>
Rebuild readable resumes with embedded Vazirmatn and consistent RTL layout
</commit_message>
<xml_diff>
--- a/public/resumes/Mehrad-Yaghoubi-AI-Engineering-Resume-FA.docx
+++ b/public/resumes/Mehrad-Yaghoubi-AI-Engineering-Resume-FA.docx
@@ -5,14 +5,18 @@
     <w:p>
       <w:pPr>
         <w:pStyle w:val="Title"/>
+        <w:keepNext/>
+        <w:keepLines/>
         <w:bidi/>
+        <w:spacing w:after="60" w:line="750" w:lineRule="exact"/>
       </w:pPr>
       <w:r>
         <w:rPr>
-          <w:rFonts w:ascii="Tahoma" w:hAnsi="Tahoma" w:cs="Tahoma"/>
+          <w:rFonts w:ascii="Vazirmatn" w:eastAsia="Vazirmatn" w:hAnsi="Vazirmatn" w:cs="Vazirmatn"/>
           <w:b/>
           <w:bCs/>
-          <w:szCs w:val="46"/>
+          <w:sz w:val="50"/>
+          <w:szCs w:val="50"/>
           <w:rtl/>
           <w:lang w:val="fa-IR" w:bidi="fa-IR"/>
         </w:rPr>
@@ -21,18 +25,283 @@
     </w:p>
     <w:p>
       <w:pPr>
+        <w:keepNext/>
+        <w:keepLines/>
         <w:bidi/>
-        <w:rPr>
-          <w:rFonts w:hint="eastAsia"/>
-        </w:rPr>
+        <w:spacing w:after="80" w:line="390" w:lineRule="exact"/>
       </w:pPr>
       <w:r>
         <w:rPr>
-          <w:rFonts w:cs="Tahoma"/>
+          <w:rFonts w:eastAsia="Vazirmatn" w:cs="Vazirmatn"/>
           <w:b/>
           <w:bCs/>
-          <w:color w:val="1B2C3B"/>
-          <w:sz w:val="23"/>
+          <w:color w:val="000000"/>
+          <w:sz w:val="26"/>
+          <w:szCs w:val="26"/>
+          <w:rtl/>
+          <w:lang w:val="fa-IR" w:bidi="fa-IR"/>
+        </w:rPr>
+        <w:t>متخصص هوش مصنوعی</w:t>
+      </w:r>
+    </w:p>
+    <w:p>
+      <w:pPr>
+        <w:keepNext/>
+        <w:keepLines/>
+        <w:bidi/>
+        <w:spacing w:after="60" w:line="283" w:lineRule="exact"/>
+      </w:pPr>
+      <w:r>
+        <w:rPr>
+          <w:rFonts w:ascii="Arial" w:eastAsia="Arial" w:hAnsi="Arial" w:cs="Arial"/>
+          <w:color w:val="17212B"/>
+          <w:sz w:val="21"/>
+          <w:szCs w:val="21"/>
+          <w:lang w:bidi="en-US"/>
+        </w:rPr>
+        <w:t>Mehrad Yaghoubi</w:t>
+      </w:r>
+    </w:p>
+    <w:p>
+      <w:pPr>
+        <w:keepNext/>
+        <w:keepLines/>
+        <w:bidi/>
+        <w:spacing w:after="60" w:line="315" w:lineRule="exact"/>
+      </w:pPr>
+      <w:r>
+        <w:rPr>
+          <w:rFonts w:eastAsia="Vazirmatn" w:cs="Vazirmatn"/>
+          <w:color w:val="17212B"/>
+          <w:sz w:val="21"/>
+          <w:szCs w:val="21"/>
+          <w:rtl/>
+          <w:lang w:val="fa-IR" w:bidi="fa-IR"/>
+        </w:rPr>
+        <w:t>کرج، ایران</w:t>
+      </w:r>
+    </w:p>
+    <w:p>
+      <w:pPr>
+        <w:keepLines/>
+        <w:bidi/>
+        <w:spacing w:after="80" w:line="345" w:lineRule="exact"/>
+      </w:pPr>
+      <w:hyperlink r:id="rId8">
+        <w:r>
+          <w:rPr>
+            <w:rFonts w:ascii="Arial" w:eastAsia="Arial" w:hAnsi="Arial" w:cs="Arial"/>
+            <w:color w:val="175A82"/>
+            <w:sz w:val="21"/>
+            <w:szCs w:val="21"/>
+            <w:lang w:bidi="en-US"/>
+          </w:rPr>
+          <w:t>‎mehradyaghoubi96@gmail.com‎</w:t>
+        </w:r>
+      </w:hyperlink>
+      <w:r>
+        <w:rPr>
+          <w:rFonts w:eastAsia="Vazirmatn" w:cs="Vazirmatn"/>
+          <w:color w:val="17212B"/>
+          <w:sz w:val="21"/>
+          <w:szCs w:val="21"/>
+          <w:rtl/>
+          <w:lang w:val="fa-IR" w:bidi="fa-IR"/>
+        </w:rPr>
+        <w:t xml:space="preserve">  ·  </w:t>
+      </w:r>
+      <w:hyperlink r:id="rId9">
+        <w:r>
+          <w:rPr>
+            <w:rFonts w:ascii="Arial" w:eastAsia="Arial" w:hAnsi="Arial" w:cs="Arial"/>
+            <w:color w:val="175A82"/>
+            <w:sz w:val="21"/>
+            <w:szCs w:val="21"/>
+            <w:lang w:bidi="en-US"/>
+          </w:rPr>
+          <w:t>‎09912093038‎</w:t>
+        </w:r>
+      </w:hyperlink>
+    </w:p>
+    <w:p>
+      <w:pPr>
+        <w:keepLines/>
+        <w:bidi/>
+        <w:spacing w:after="140" w:line="345" w:lineRule="exact"/>
+      </w:pPr>
+      <w:hyperlink r:id="rId10">
+        <w:r>
+          <w:rPr>
+            <w:rFonts w:eastAsia="Vazirmatn" w:cs="Vazirmatn"/>
+            <w:color w:val="175A82"/>
+            <w:sz w:val="21"/>
+            <w:szCs w:val="21"/>
+            <w:rtl/>
+            <w:lang w:val="fa-IR" w:bidi="fa-IR"/>
+          </w:rPr>
+          <w:t>وب‌سایت شخصی</w:t>
+        </w:r>
+      </w:hyperlink>
+      <w:r>
+        <w:rPr>
+          <w:rFonts w:eastAsia="Vazirmatn" w:cs="Vazirmatn"/>
+          <w:color w:val="17212B"/>
+          <w:sz w:val="21"/>
+          <w:szCs w:val="21"/>
+          <w:rtl/>
+          <w:lang w:val="fa-IR" w:bidi="fa-IR"/>
+        </w:rPr>
+        <w:t xml:space="preserve">  ·  </w:t>
+      </w:r>
+      <w:hyperlink r:id="rId11">
+        <w:r>
+          <w:rPr>
+            <w:rFonts w:ascii="Arial" w:eastAsia="Arial" w:hAnsi="Arial" w:cs="Arial"/>
+            <w:color w:val="175A82"/>
+            <w:sz w:val="21"/>
+            <w:szCs w:val="21"/>
+            <w:lang w:bidi="en-US"/>
+          </w:rPr>
+          <w:t>‎GitHub‎</w:t>
+        </w:r>
+      </w:hyperlink>
+      <w:r>
+        <w:rPr>
+          <w:rFonts w:eastAsia="Vazirmatn" w:cs="Vazirmatn"/>
+          <w:color w:val="17212B"/>
+          <w:sz w:val="21"/>
+          <w:szCs w:val="21"/>
+          <w:rtl/>
+          <w:lang w:val="fa-IR" w:bidi="fa-IR"/>
+        </w:rPr>
+        <w:t xml:space="preserve">  ·  </w:t>
+      </w:r>
+      <w:hyperlink r:id="rId12">
+        <w:r>
+          <w:rPr>
+            <w:rFonts w:ascii="Arial" w:eastAsia="Arial" w:hAnsi="Arial" w:cs="Arial"/>
+            <w:color w:val="175A82"/>
+            <w:sz w:val="21"/>
+            <w:szCs w:val="21"/>
+            <w:lang w:bidi="en-US"/>
+          </w:rPr>
+          <w:t>‎LinkedIn‎</w:t>
+        </w:r>
+      </w:hyperlink>
+    </w:p>
+    <w:p>
+      <w:pPr>
+        <w:pStyle w:val="Heading1"/>
+        <w:bidi/>
+        <w:spacing w:before="180" w:after="100" w:line="405" w:lineRule="exact"/>
+      </w:pPr>
+      <w:r>
+        <w:rPr>
+          <w:rFonts w:ascii="Vazirmatn" w:eastAsia="Vazirmatn" w:hAnsi="Vazirmatn" w:cs="Vazirmatn"/>
+          <w:sz w:val="27"/>
+          <w:szCs w:val="27"/>
+          <w:rtl/>
+          <w:lang w:val="fa-IR" w:bidi="fa-IR"/>
+        </w:rPr>
+        <w:t>معرفی</w:t>
+      </w:r>
+    </w:p>
+    <w:p>
+      <w:pPr>
+        <w:keepLines/>
+        <w:bidi/>
+        <w:spacing w:after="100" w:line="345" w:lineRule="exact"/>
+      </w:pPr>
+      <w:r>
+        <w:rPr>
+          <w:rFonts w:eastAsia="Vazirmatn" w:cs="Vazirmatn"/>
+          <w:color w:val="17212B"/>
+          <w:szCs w:val="23"/>
+          <w:rtl/>
+          <w:lang w:val="fa-IR" w:bidi="fa-IR"/>
+        </w:rPr>
+        <w:t>متخصص هوش مصنوعی با تجربه توسعه چت‌بات، اتصال سرویس‌های هوش مصنوعی به وب و پژوهش در بازشناسی گفتار دیداری.</w:t>
+      </w:r>
+    </w:p>
+    <w:p>
+      <w:pPr>
+        <w:pStyle w:val="Heading1"/>
+        <w:bidi/>
+        <w:spacing w:before="180" w:after="100" w:line="405" w:lineRule="exact"/>
+      </w:pPr>
+      <w:r>
+        <w:rPr>
+          <w:rFonts w:ascii="Vazirmatn" w:eastAsia="Vazirmatn" w:hAnsi="Vazirmatn" w:cs="Vazirmatn"/>
+          <w:sz w:val="27"/>
+          <w:szCs w:val="27"/>
+          <w:rtl/>
+          <w:lang w:val="fa-IR" w:bidi="fa-IR"/>
+        </w:rPr>
+        <w:t>مهارت‌های فنی</w:t>
+      </w:r>
+    </w:p>
+    <w:p>
+      <w:pPr>
+        <w:keepLines/>
+        <w:bidi/>
+        <w:spacing w:after="100" w:line="310" w:lineRule="exact"/>
+      </w:pPr>
+      <w:r>
+        <w:rPr>
+          <w:rFonts w:ascii="Arial" w:eastAsia="Arial" w:hAnsi="Arial" w:cs="Arial"/>
+          <w:color w:val="17212B"/>
+          <w:szCs w:val="23"/>
+          <w:lang w:bidi="en-US"/>
+        </w:rPr>
+        <w:t>Python · PyTorch (CUDA) · OpenCV · MediaPipe</w:t>
+      </w:r>
+    </w:p>
+    <w:p>
+      <w:pPr>
+        <w:keepLines/>
+        <w:bidi/>
+        <w:spacing w:after="100" w:line="310" w:lineRule="exact"/>
+      </w:pPr>
+      <w:r>
+        <w:rPr>
+          <w:rFonts w:ascii="Arial" w:eastAsia="Arial" w:hAnsi="Arial" w:cs="Arial"/>
+          <w:color w:val="17212B"/>
+          <w:szCs w:val="23"/>
+          <w:lang w:bidi="en-US"/>
+        </w:rPr>
+        <w:t>FastAPI · REST APIs · WordPress · Git · Linux</w:t>
+      </w:r>
+    </w:p>
+    <w:p>
+      <w:pPr>
+        <w:pStyle w:val="Heading1"/>
+        <w:bidi/>
+        <w:spacing w:before="180" w:after="100" w:line="405" w:lineRule="exact"/>
+      </w:pPr>
+      <w:r>
+        <w:rPr>
+          <w:rFonts w:ascii="Vazirmatn" w:eastAsia="Vazirmatn" w:hAnsi="Vazirmatn" w:cs="Vazirmatn"/>
+          <w:sz w:val="27"/>
+          <w:szCs w:val="27"/>
+          <w:rtl/>
+          <w:lang w:val="fa-IR" w:bidi="fa-IR"/>
+        </w:rPr>
+        <w:t>سوابق کاری</w:t>
+      </w:r>
+    </w:p>
+    <w:p>
+      <w:pPr>
+        <w:keepNext/>
+        <w:keepLines/>
+        <w:bidi/>
+        <w:spacing w:after="40" w:line="345" w:lineRule="exact"/>
+      </w:pPr>
+      <w:r>
+        <w:rPr>
+          <w:rFonts w:eastAsia="Vazirmatn" w:cs="Vazirmatn"/>
+          <w:b/>
+          <w:bCs/>
+          <w:color w:val="17212B"/>
           <w:szCs w:val="23"/>
           <w:rtl/>
           <w:lang w:val="fa-IR" w:bidi="fa-IR"/>
@@ -42,246 +311,35 @@
     </w:p>
     <w:p>
       <w:pPr>
-        <w:rPr>
-          <w:rFonts w:hint="eastAsia"/>
-        </w:rPr>
+        <w:keepNext/>
+        <w:keepLines/>
+        <w:bidi/>
+        <w:spacing w:after="60" w:line="315" w:lineRule="exact"/>
       </w:pPr>
       <w:r>
         <w:rPr>
-          <w:rFonts w:ascii="Arial" w:hAnsi="Arial" w:cs="Arial"/>
-          <w:color w:val="1B2C3B"/>
-          <w:sz w:val="20"/>
-          <w:lang w:bidi="en-US"/>
-        </w:rPr>
-        <w:t>Mehrad Yaghoubi</w:t>
-      </w:r>
-    </w:p>
-    <w:p>
-      <w:pPr>
-        <w:bidi/>
-        <w:spacing w:after="60"/>
-        <w:rPr>
-          <w:rFonts w:hint="eastAsia"/>
-        </w:rPr>
-      </w:pPr>
-      <w:r>
-        <w:rPr>
-          <w:rFonts w:cs="Tahoma"/>
-          <w:color w:val="1B2C3B"/>
-          <w:sz w:val="17"/>
-          <w:szCs w:val="17"/>
-          <w:rtl/>
-          <w:lang w:val="fa-IR" w:bidi="fa-IR"/>
-        </w:rPr>
-        <w:t xml:space="preserve">کرج، ایران | </w:t>
-      </w:r>
-      <w:r>
-        <w:rPr>
-          <w:rFonts w:ascii="Arial" w:hAnsi="Arial" w:cs="Tahoma"/>
-          <w:color w:val="1B2C3B"/>
-          <w:sz w:val="17"/>
-          <w:szCs w:val="17"/>
-          <w:lang w:bidi="fa-IR"/>
-        </w:rPr>
-        <w:t>mehradyaghoubi96@gmail.com</w:t>
-      </w:r>
-      <w:r>
-        <w:rPr>
-          <w:rFonts w:ascii="Arial" w:hAnsi="Arial" w:cs="Arial"/>
-          <w:color w:val="1B2C3B"/>
-          <w:sz w:val="17"/>
-          <w:lang w:bidi="en-US"/>
-        </w:rPr>
-        <w:t xml:space="preserve"> | 09912093038</w:t>
-      </w:r>
-    </w:p>
-    <w:p>
-      <w:pPr>
-        <w:spacing w:after="60"/>
-        <w:rPr>
-          <w:rFonts w:hint="eastAsia"/>
-        </w:rPr>
-      </w:pPr>
-      <w:r>
-        <w:rPr>
-          <w:rFonts w:ascii="Arial" w:hAnsi="Arial" w:cs="Tahoma"/>
-          <w:color w:val="1B2C3B"/>
-          <w:sz w:val="17"/>
-          <w:szCs w:val="17"/>
-          <w:lang w:bidi="fa-IR"/>
-        </w:rPr>
-        <w:t>https://mehradyaghoubi.github.io/</w:t>
-      </w:r>
-      <w:r>
-        <w:rPr>
-          <w:rFonts w:cs="Tahoma"/>
-          <w:color w:val="1B2C3B"/>
-          <w:sz w:val="17"/>
-          <w:szCs w:val="17"/>
-          <w:rtl/>
-          <w:lang w:val="fa-IR" w:bidi="fa-IR"/>
-        </w:rPr>
-        <w:t xml:space="preserve"> | </w:t>
-      </w:r>
-      <w:r>
-        <w:rPr>
-          <w:rFonts w:ascii="Arial" w:hAnsi="Arial" w:cs="Tahoma"/>
-          <w:color w:val="1B2C3B"/>
-          <w:sz w:val="17"/>
-          <w:szCs w:val="17"/>
-          <w:lang w:bidi="fa-IR"/>
-        </w:rPr>
-        <w:t>https://github.com/MehradYaghoubi</w:t>
-      </w:r>
-      <w:r>
-        <w:rPr>
-          <w:rFonts w:cs="Tahoma"/>
-          <w:color w:val="1B2C3B"/>
-          <w:sz w:val="17"/>
-          <w:szCs w:val="17"/>
-          <w:rtl/>
-          <w:lang w:val="fa-IR" w:bidi="fa-IR"/>
-        </w:rPr>
-        <w:t xml:space="preserve"> | </w:t>
-      </w:r>
-      <w:r>
-        <w:rPr>
-          <w:rFonts w:ascii="Arial" w:hAnsi="Arial" w:cs="Tahoma"/>
-          <w:color w:val="1B2C3B"/>
-          <w:sz w:val="17"/>
-          <w:szCs w:val="17"/>
-          <w:lang w:bidi="fa-IR"/>
-        </w:rPr>
-        <w:t>https://www.linkedin.com/in/mehrad-yaghoubi</w:t>
-      </w:r>
-    </w:p>
-    <w:p>
-      <w:pPr>
-        <w:pStyle w:val="Heading1"/>
-        <w:bidi/>
-      </w:pPr>
-      <w:r>
-        <w:rPr>
-          <w:rFonts w:ascii="Tahoma" w:hAnsi="Tahoma" w:cs="Tahoma"/>
-          <w:color w:val="1B2C3B"/>
-          <w:szCs w:val="23"/>
-          <w:rtl/>
-          <w:lang w:val="fa-IR" w:bidi="fa-IR"/>
-        </w:rPr>
-        <w:t>معرفی</w:t>
-      </w:r>
-    </w:p>
-    <w:p>
-      <w:pPr>
-        <w:keepLines/>
-        <w:bidi/>
-        <w:rPr>
-          <w:rFonts w:hint="eastAsia"/>
-        </w:rPr>
-      </w:pPr>
-      <w:r>
-        <w:rPr>
-          <w:rFonts w:cs="Tahoma"/>
-          <w:color w:val="1B2C3B"/>
+          <w:rFonts w:eastAsia="Vazirmatn" w:cs="Vazirmatn"/>
+          <w:color w:val="334155"/>
+          <w:sz w:val="21"/>
           <w:szCs w:val="21"/>
           <w:rtl/>
           <w:lang w:val="fa-IR" w:bidi="fa-IR"/>
         </w:rPr>
-        <w:t>متخصص هوش مصنوعی با تجربه توسعه چت‌بات، اتصال سرویس‌های هوش مصنوعی به وب و پژوهش در بازشناسی گفتار دیداری.</w:t>
+        <w:t>شرکت قاصدک پیک شهر · سال ۱۴۰۵، دو ماه</w:t>
       </w:r>
     </w:p>
     <w:p>
       <w:pPr>
-        <w:pStyle w:val="Heading1"/>
+        <w:keepNext/>
+        <w:keepLines/>
         <w:bidi/>
+        <w:spacing w:after="80" w:line="345" w:lineRule="exact"/>
       </w:pPr>
       <w:r>
         <w:rPr>
-          <w:rFonts w:ascii="Tahoma" w:hAnsi="Tahoma" w:cs="Tahoma"/>
-          <w:color w:val="1B2C3B"/>
+          <w:rFonts w:eastAsia="Vazirmatn" w:cs="Vazirmatn"/>
+          <w:color w:val="17212B"/>
           <w:szCs w:val="23"/>
-          <w:rtl/>
-          <w:lang w:val="fa-IR" w:bidi="fa-IR"/>
-        </w:rPr>
-        <w:t>مهارت‌های فنی</w:t>
-      </w:r>
-    </w:p>
-    <w:p>
-      <w:pPr>
-        <w:keepLines/>
-        <w:rPr>
-          <w:rFonts w:hint="eastAsia"/>
-        </w:rPr>
-      </w:pPr>
-      <w:r>
-        <w:rPr>
-          <w:rFonts w:ascii="Arial" w:hAnsi="Arial" w:cs="Arial"/>
-          <w:color w:val="1B2C3B"/>
-          <w:lang w:bidi="en-US"/>
-        </w:rPr>
-        <w:t>Python, PyTorch (CUDA), OpenCV, MediaPipe, FastAPI, REST APIs, WordPress, Git, Linux</w:t>
-      </w:r>
-    </w:p>
-    <w:p>
-      <w:pPr>
-        <w:pStyle w:val="Heading1"/>
-        <w:bidi/>
-      </w:pPr>
-      <w:r>
-        <w:rPr>
-          <w:rFonts w:ascii="Tahoma" w:hAnsi="Tahoma" w:cs="Tahoma"/>
-          <w:color w:val="1B2C3B"/>
-          <w:szCs w:val="23"/>
-          <w:rtl/>
-          <w:lang w:val="fa-IR" w:bidi="fa-IR"/>
-        </w:rPr>
-        <w:t>سوابق کاری</w:t>
-      </w:r>
-    </w:p>
-    <w:p>
-      <w:pPr>
-        <w:keepLines/>
-        <w:bidi/>
-        <w:rPr>
-          <w:rFonts w:hint="eastAsia"/>
-        </w:rPr>
-      </w:pPr>
-      <w:r>
-        <w:rPr>
-          <w:rFonts w:cs="Tahoma"/>
-          <w:b/>
-          <w:bCs/>
-          <w:color w:val="1B2C3B"/>
-          <w:szCs w:val="21"/>
-          <w:rtl/>
-          <w:lang w:val="fa-IR" w:bidi="fa-IR"/>
-        </w:rPr>
-        <w:t>متخصص هوش مصنوعی</w:t>
-      </w:r>
-      <w:r>
-        <w:rPr>
-          <w:rFonts w:cs="Tahoma"/>
-          <w:color w:val="1B2C3B"/>
-          <w:szCs w:val="21"/>
-          <w:rtl/>
-          <w:lang w:val="fa-IR" w:bidi="fa-IR"/>
-        </w:rPr>
-        <w:t xml:space="preserve"> | شرکت قاصدک پیک شهر | سال ۱۴۰۵، دو ماه</w:t>
-      </w:r>
-    </w:p>
-    <w:p>
-      <w:pPr>
-        <w:keepLines/>
-        <w:bidi/>
-        <w:rPr>
-          <w:rFonts w:hint="eastAsia"/>
-        </w:rPr>
-      </w:pPr>
-      <w:r>
-        <w:rPr>
-          <w:rFonts w:cs="Tahoma"/>
-          <w:color w:val="1B2C3B"/>
-          <w:szCs w:val="21"/>
           <w:rtl/>
           <w:lang w:val="fa-IR" w:bidi="fa-IR"/>
         </w:rPr>
@@ -289,27 +347,26 @@
       </w:r>
       <w:r>
         <w:rPr>
-          <w:rFonts w:ascii="Arial" w:hAnsi="Arial" w:cs="Tahoma"/>
-          <w:color w:val="1B2C3B"/>
-          <w:szCs w:val="21"/>
-          <w:lang w:bidi="fa-IR"/>
+          <w:rFonts w:ascii="Arial" w:eastAsia="Arial" w:hAnsi="Arial" w:cs="Arial"/>
+          <w:color w:val="17212B"/>
+          <w:szCs w:val="23"/>
+          <w:lang w:bidi="en-US"/>
         </w:rPr>
-        <w:t>WordPress.</w:t>
+        <w:t>‎WordPress.‎</w:t>
       </w:r>
     </w:p>
     <w:p>
       <w:pPr>
+        <w:keepNext/>
         <w:keepLines/>
         <w:bidi/>
-        <w:rPr>
-          <w:rFonts w:hint="eastAsia"/>
-        </w:rPr>
+        <w:spacing w:after="80" w:line="345" w:lineRule="exact"/>
       </w:pPr>
       <w:r>
         <w:rPr>
-          <w:rFonts w:cs="Tahoma"/>
-          <w:color w:val="1B2C3B"/>
-          <w:szCs w:val="21"/>
+          <w:rFonts w:eastAsia="Vazirmatn" w:cs="Vazirmatn"/>
+          <w:color w:val="17212B"/>
+          <w:szCs w:val="23"/>
           <w:rtl/>
           <w:lang w:val="fa-IR" w:bidi="fa-IR"/>
         </w:rPr>
@@ -320,15 +377,13 @@
       <w:pPr>
         <w:keepLines/>
         <w:bidi/>
-        <w:rPr>
-          <w:rFonts w:hint="eastAsia"/>
-        </w:rPr>
+        <w:spacing w:after="140" w:line="345" w:lineRule="exact"/>
       </w:pPr>
       <w:r>
         <w:rPr>
-          <w:rFonts w:cs="Tahoma"/>
-          <w:color w:val="1B2C3B"/>
-          <w:szCs w:val="21"/>
+          <w:rFonts w:eastAsia="Vazirmatn" w:cs="Vazirmatn"/>
+          <w:color w:val="17212B"/>
+          <w:szCs w:val="23"/>
           <w:rtl/>
           <w:lang w:val="fa-IR" w:bidi="fa-IR"/>
         </w:rPr>
@@ -339,12 +394,720 @@
       <w:pPr>
         <w:pStyle w:val="Heading1"/>
         <w:bidi/>
+        <w:spacing w:before="180" w:after="100" w:line="405" w:lineRule="exact"/>
       </w:pPr>
       <w:r>
         <w:rPr>
-          <w:rFonts w:ascii="Tahoma" w:hAnsi="Tahoma" w:cs="Tahoma"/>
-          <w:color w:val="1B2C3B"/>
+          <w:rFonts w:ascii="Vazirmatn" w:eastAsia="Vazirmatn" w:hAnsi="Vazirmatn" w:cs="Vazirmatn"/>
+          <w:sz w:val="27"/>
+          <w:szCs w:val="27"/>
+          <w:rtl/>
+          <w:lang w:val="fa-IR" w:bidi="fa-IR"/>
+        </w:rPr>
+        <w:t>پروژه‌های منتخب</w:t>
+      </w:r>
+    </w:p>
+    <w:p>
+      <w:pPr>
+        <w:keepNext/>
+        <w:keepLines/>
+        <w:bidi/>
+        <w:spacing w:after="40" w:line="310" w:lineRule="exact"/>
+      </w:pPr>
+      <w:r>
+        <w:rPr>
+          <w:rFonts w:ascii="Arial" w:eastAsia="Arial" w:hAnsi="Arial" w:cs="Arial"/>
+          <w:b/>
+          <w:bCs/>
+          <w:color w:val="17212B"/>
           <w:szCs w:val="23"/>
+          <w:lang w:bidi="en-US"/>
+        </w:rPr>
+        <w:t>EGOSD</w:t>
+      </w:r>
+    </w:p>
+    <w:p>
+      <w:pPr>
+        <w:keepNext/>
+        <w:keepLines/>
+        <w:bidi/>
+        <w:spacing w:after="80" w:line="345" w:lineRule="exact"/>
+      </w:pPr>
+      <w:r>
+        <w:rPr>
+          <w:rFonts w:eastAsia="Vazirmatn" w:cs="Vazirmatn"/>
+          <w:color w:val="17212B"/>
+          <w:szCs w:val="23"/>
+          <w:rtl/>
+          <w:lang w:val="fa-IR" w:bidi="fa-IR"/>
+        </w:rPr>
+        <w:t>خودتقطیری مبتنی بر عدم قطعیت برای بازشناسی گفتار دیداری. آموزش و اجرای مدل روی پردازنده گرافیکی.</w:t>
+      </w:r>
+    </w:p>
+    <w:p>
+      <w:pPr>
+        <w:keepNext/>
+        <w:keepLines/>
+        <w:bidi/>
+        <w:spacing w:after="40" w:line="315" w:lineRule="exact"/>
+      </w:pPr>
+      <w:r>
+        <w:rPr>
+          <w:rFonts w:eastAsia="Vazirmatn" w:cs="Vazirmatn"/>
+          <w:color w:val="334155"/>
+          <w:sz w:val="21"/>
+          <w:szCs w:val="21"/>
+          <w:rtl/>
+          <w:lang w:val="fa-IR" w:bidi="fa-IR"/>
+        </w:rPr>
+        <w:t>در حال داوری در مجله</w:t>
+      </w:r>
+    </w:p>
+    <w:p>
+      <w:pPr>
+        <w:keepNext/>
+        <w:keepLines/>
+        <w:bidi/>
+        <w:spacing w:after="60" w:line="283" w:lineRule="exact"/>
+      </w:pPr>
+      <w:r>
+        <w:rPr>
+          <w:rFonts w:ascii="Arial" w:eastAsia="Arial" w:hAnsi="Arial" w:cs="Arial"/>
+          <w:color w:val="334155"/>
+          <w:sz w:val="21"/>
+          <w:szCs w:val="21"/>
+          <w:lang w:bidi="en-US"/>
+        </w:rPr>
+        <w:t>The Visual Computer</w:t>
+      </w:r>
+    </w:p>
+    <w:p>
+      <w:pPr>
+        <w:keepLines/>
+        <w:bidi/>
+        <w:spacing w:after="140" w:line="345" w:lineRule="exact"/>
+      </w:pPr>
+      <w:hyperlink r:id="rId13">
+        <w:r>
+          <w:rPr>
+            <w:rFonts w:eastAsia="Vazirmatn" w:cs="Vazirmatn"/>
+            <w:color w:val="175A82"/>
+            <w:sz w:val="21"/>
+            <w:szCs w:val="21"/>
+            <w:rtl/>
+            <w:lang w:val="fa-IR" w:bidi="fa-IR"/>
+          </w:rPr>
+          <w:t>پیش‌چاپ مقاله</w:t>
+        </w:r>
+      </w:hyperlink>
+    </w:p>
+    <w:p>
+      <w:pPr>
+        <w:keepNext/>
+        <w:keepLines/>
+        <w:bidi/>
+        <w:spacing w:after="40" w:line="310" w:lineRule="exact"/>
+      </w:pPr>
+      <w:r>
+        <w:rPr>
+          <w:rFonts w:ascii="Arial" w:eastAsia="Arial" w:hAnsi="Arial" w:cs="Arial"/>
+          <w:b/>
+          <w:bCs/>
+          <w:color w:val="17212B"/>
+          <w:szCs w:val="23"/>
+          <w:lang w:bidi="en-US"/>
+        </w:rPr>
+        <w:t>PyLipExtractor</w:t>
+      </w:r>
+    </w:p>
+    <w:p>
+      <w:pPr>
+        <w:keepNext/>
+        <w:keepLines/>
+        <w:bidi/>
+        <w:spacing w:after="80" w:line="345" w:lineRule="exact"/>
+      </w:pPr>
+      <w:r>
+        <w:rPr>
+          <w:rFonts w:eastAsia="Vazirmatn" w:cs="Vazirmatn"/>
+          <w:color w:val="17212B"/>
+          <w:szCs w:val="23"/>
+          <w:rtl/>
+          <w:lang w:val="fa-IR" w:bidi="fa-IR"/>
+        </w:rPr>
+        <w:t>بسته متن‌باز استخراج ناحیه لب از ویدئو با هموارسازی زمانی و تنظیم اختیاری روشنایی.</w:t>
+      </w:r>
+    </w:p>
+    <w:p>
+      <w:pPr>
+        <w:keepLines/>
+        <w:bidi/>
+        <w:spacing w:after="140" w:line="345" w:lineRule="exact"/>
+      </w:pPr>
+      <w:hyperlink r:id="rId14">
+        <w:r>
+          <w:rPr>
+            <w:rFonts w:ascii="Arial" w:eastAsia="Arial" w:hAnsi="Arial" w:cs="Arial"/>
+            <w:color w:val="175A82"/>
+            <w:sz w:val="21"/>
+            <w:szCs w:val="21"/>
+            <w:lang w:bidi="en-US"/>
+          </w:rPr>
+          <w:t>‎GitHub‎</w:t>
+        </w:r>
+      </w:hyperlink>
+      <w:r>
+        <w:rPr>
+          <w:rFonts w:eastAsia="Vazirmatn" w:cs="Vazirmatn"/>
+          <w:color w:val="17212B"/>
+          <w:sz w:val="21"/>
+          <w:szCs w:val="21"/>
+          <w:rtl/>
+          <w:lang w:val="fa-IR" w:bidi="fa-IR"/>
+        </w:rPr>
+        <w:t xml:space="preserve">  ·  </w:t>
+      </w:r>
+      <w:hyperlink r:id="rId15">
+        <w:r>
+          <w:rPr>
+            <w:rFonts w:ascii="Arial" w:eastAsia="Arial" w:hAnsi="Arial" w:cs="Arial"/>
+            <w:color w:val="175A82"/>
+            <w:sz w:val="21"/>
+            <w:szCs w:val="21"/>
+            <w:lang w:bidi="en-US"/>
+          </w:rPr>
+          <w:t>‎PyPI‎</w:t>
+        </w:r>
+      </w:hyperlink>
+    </w:p>
+    <w:p>
+      <w:pPr>
+        <w:keepNext/>
+        <w:keepLines/>
+        <w:bidi/>
+        <w:spacing w:after="40" w:line="345" w:lineRule="exact"/>
+      </w:pPr>
+      <w:r>
+        <w:rPr>
+          <w:rFonts w:eastAsia="Vazirmatn" w:cs="Vazirmatn"/>
+          <w:b/>
+          <w:bCs/>
+          <w:color w:val="17212B"/>
+          <w:szCs w:val="23"/>
+          <w:rtl/>
+          <w:lang w:val="fa-IR" w:bidi="fa-IR"/>
+        </w:rPr>
+        <w:t>شوفاژ یعقوبی</w:t>
+      </w:r>
+    </w:p>
+    <w:p>
+      <w:pPr>
+        <w:keepNext/>
+        <w:keepLines/>
+        <w:bidi/>
+        <w:spacing w:after="80" w:line="345" w:lineRule="exact"/>
+      </w:pPr>
+      <w:r>
+        <w:rPr>
+          <w:rFonts w:eastAsia="Vazirmatn" w:cs="Vazirmatn"/>
+          <w:color w:val="17212B"/>
+          <w:szCs w:val="23"/>
+          <w:rtl/>
+          <w:lang w:val="fa-IR" w:bidi="fa-IR"/>
+        </w:rPr>
+        <w:t>توسعه وب‌سایت خدماتی و فروشگاهی در زمینه تجهیزات گرمایشی.</w:t>
+      </w:r>
+    </w:p>
+    <w:p>
+      <w:pPr>
+        <w:keepLines/>
+        <w:bidi/>
+        <w:spacing w:after="140" w:line="345" w:lineRule="exact"/>
+      </w:pPr>
+      <w:hyperlink r:id="rId16">
+        <w:r>
+          <w:rPr>
+            <w:rFonts w:eastAsia="Vazirmatn" w:cs="Vazirmatn"/>
+            <w:color w:val="175A82"/>
+            <w:sz w:val="21"/>
+            <w:szCs w:val="21"/>
+            <w:rtl/>
+            <w:lang w:val="fa-IR" w:bidi="fa-IR"/>
+          </w:rPr>
+          <w:t>وب‌سایت</w:t>
+        </w:r>
+      </w:hyperlink>
+    </w:p>
+    <w:p>
+      <w:pPr>
+        <w:keepNext/>
+        <w:keepLines/>
+        <w:bidi/>
+        <w:spacing w:after="40" w:line="345" w:lineRule="exact"/>
+      </w:pPr>
+      <w:r>
+        <w:rPr>
+          <w:rFonts w:eastAsia="Vazirmatn" w:cs="Vazirmatn"/>
+          <w:b/>
+          <w:bCs/>
+          <w:color w:val="17212B"/>
+          <w:szCs w:val="23"/>
+          <w:rtl/>
+          <w:lang w:val="fa-IR" w:bidi="fa-IR"/>
+        </w:rPr>
+        <w:t>ابزار تشخیص متن</w:t>
+      </w:r>
+    </w:p>
+    <w:p>
+      <w:pPr>
+        <w:keepLines/>
+        <w:bidi/>
+        <w:spacing w:after="140" w:line="345" w:lineRule="exact"/>
+      </w:pPr>
+      <w:r>
+        <w:rPr>
+          <w:rFonts w:eastAsia="Vazirmatn" w:cs="Vazirmatn"/>
+          <w:color w:val="17212B"/>
+          <w:szCs w:val="23"/>
+          <w:rtl/>
+          <w:lang w:val="fa-IR" w:bidi="fa-IR"/>
+        </w:rPr>
+        <w:t xml:space="preserve">تشخیص متن با استفاده از یک </w:t>
+      </w:r>
+      <w:r>
+        <w:rPr>
+          <w:rFonts w:ascii="Arial" w:eastAsia="Arial" w:hAnsi="Arial" w:cs="Arial"/>
+          <w:color w:val="17212B"/>
+          <w:szCs w:val="23"/>
+          <w:lang w:bidi="en-US"/>
+        </w:rPr>
+        <w:t>‎API‎</w:t>
+      </w:r>
+      <w:r>
+        <w:rPr>
+          <w:rFonts w:eastAsia="Vazirmatn" w:cs="Vazirmatn"/>
+          <w:color w:val="17212B"/>
+          <w:szCs w:val="23"/>
+          <w:rtl/>
+          <w:lang w:val="fa-IR" w:bidi="fa-IR"/>
+        </w:rPr>
+        <w:t xml:space="preserve"> خارجی.</w:t>
+      </w:r>
+    </w:p>
+    <w:p>
+      <w:pPr>
+        <w:keepNext/>
+        <w:keepLines/>
+        <w:bidi/>
+        <w:spacing w:after="40" w:line="345" w:lineRule="exact"/>
+      </w:pPr>
+      <w:r>
+        <w:rPr>
+          <w:rFonts w:eastAsia="Vazirmatn" w:cs="Vazirmatn"/>
+          <w:b/>
+          <w:bCs/>
+          <w:color w:val="17212B"/>
+          <w:szCs w:val="23"/>
+          <w:rtl/>
+          <w:lang w:val="fa-IR" w:bidi="fa-IR"/>
+        </w:rPr>
+        <w:t xml:space="preserve">چت‌بات شخصی </w:t>
+      </w:r>
+      <w:r>
+        <w:rPr>
+          <w:rFonts w:ascii="Arial" w:eastAsia="Arial" w:hAnsi="Arial" w:cs="Arial"/>
+          <w:b/>
+          <w:bCs/>
+          <w:color w:val="17212B"/>
+          <w:szCs w:val="23"/>
+          <w:lang w:bidi="en-US"/>
+        </w:rPr>
+        <w:t>‎RAG‎</w:t>
+      </w:r>
+    </w:p>
+    <w:p>
+      <w:pPr>
+        <w:keepLines/>
+        <w:bidi/>
+        <w:spacing w:after="140" w:line="315" w:lineRule="exact"/>
+      </w:pPr>
+      <w:r>
+        <w:rPr>
+          <w:rFonts w:eastAsia="Vazirmatn" w:cs="Vazirmatn"/>
+          <w:color w:val="334155"/>
+          <w:sz w:val="21"/>
+          <w:szCs w:val="21"/>
+          <w:rtl/>
+          <w:lang w:val="fa-IR" w:bidi="fa-IR"/>
+        </w:rPr>
+        <w:t>در دست توسعه</w:t>
+      </w:r>
+    </w:p>
+    <w:p>
+      <w:pPr>
+        <w:pStyle w:val="Heading1"/>
+        <w:pageBreakBefore/>
+        <w:bidi/>
+        <w:spacing w:before="180" w:after="100" w:line="405" w:lineRule="exact"/>
+      </w:pPr>
+      <w:r>
+        <w:rPr>
+          <w:rFonts w:ascii="Vazirmatn" w:eastAsia="Vazirmatn" w:hAnsi="Vazirmatn" w:cs="Vazirmatn"/>
+          <w:sz w:val="27"/>
+          <w:szCs w:val="27"/>
+          <w:rtl/>
+          <w:lang w:val="fa-IR" w:bidi="fa-IR"/>
+        </w:rPr>
+        <w:lastRenderedPageBreak/>
+        <w:t>پژوهش و تدریس</w:t>
+      </w:r>
+    </w:p>
+    <w:p>
+      <w:pPr>
+        <w:keepNext/>
+        <w:keepLines/>
+        <w:bidi/>
+        <w:spacing w:after="40" w:line="345" w:lineRule="exact"/>
+      </w:pPr>
+      <w:r>
+        <w:rPr>
+          <w:rFonts w:eastAsia="Vazirmatn" w:cs="Vazirmatn"/>
+          <w:b/>
+          <w:bCs/>
+          <w:color w:val="17212B"/>
+          <w:szCs w:val="23"/>
+          <w:rtl/>
+          <w:lang w:val="fa-IR" w:bidi="fa-IR"/>
+        </w:rPr>
+        <w:t>فعالیت پژوهشی</w:t>
+      </w:r>
+    </w:p>
+    <w:p>
+      <w:pPr>
+        <w:keepLines/>
+        <w:bidi/>
+        <w:spacing w:after="140" w:line="315" w:lineRule="exact"/>
+      </w:pPr>
+      <w:r>
+        <w:rPr>
+          <w:rFonts w:eastAsia="Vazirmatn" w:cs="Vazirmatn"/>
+          <w:color w:val="334155"/>
+          <w:sz w:val="21"/>
+          <w:szCs w:val="21"/>
+          <w:rtl/>
+          <w:lang w:val="fa-IR" w:bidi="fa-IR"/>
+        </w:rPr>
+        <w:t>مرکز تحقیقات دانشگاه آزاد اسلامی واحد کرج · یک‌ونیم سال</w:t>
+      </w:r>
+    </w:p>
+    <w:p>
+      <w:pPr>
+        <w:keepNext/>
+        <w:keepLines/>
+        <w:bidi/>
+        <w:spacing w:after="40" w:line="345" w:lineRule="exact"/>
+      </w:pPr>
+      <w:r>
+        <w:rPr>
+          <w:rFonts w:eastAsia="Vazirmatn" w:cs="Vazirmatn"/>
+          <w:b/>
+          <w:bCs/>
+          <w:color w:val="17212B"/>
+          <w:szCs w:val="23"/>
+          <w:rtl/>
+          <w:lang w:val="fa-IR" w:bidi="fa-IR"/>
+        </w:rPr>
+        <w:t>مدرس رشته نرم‌افزار</w:t>
+      </w:r>
+    </w:p>
+    <w:p>
+      <w:pPr>
+        <w:keepLines/>
+        <w:bidi/>
+        <w:spacing w:after="140" w:line="315" w:lineRule="exact"/>
+      </w:pPr>
+      <w:r>
+        <w:rPr>
+          <w:rFonts w:eastAsia="Vazirmatn" w:cs="Vazirmatn"/>
+          <w:color w:val="334155"/>
+          <w:sz w:val="21"/>
+          <w:szCs w:val="21"/>
+          <w:rtl/>
+          <w:lang w:val="fa-IR" w:bidi="fa-IR"/>
+        </w:rPr>
+        <w:t>دانشکده کار و مهارت دانشگاه آزاد اسلامی واحد کرج · یک سال</w:t>
+      </w:r>
+    </w:p>
+    <w:p>
+      <w:pPr>
+        <w:keepNext/>
+        <w:keepLines/>
+        <w:bidi/>
+        <w:spacing w:after="40" w:line="345" w:lineRule="exact"/>
+      </w:pPr>
+      <w:r>
+        <w:rPr>
+          <w:rFonts w:eastAsia="Vazirmatn" w:cs="Vazirmatn"/>
+          <w:b/>
+          <w:bCs/>
+          <w:color w:val="17212B"/>
+          <w:szCs w:val="23"/>
+          <w:rtl/>
+          <w:lang w:val="fa-IR" w:bidi="fa-IR"/>
+        </w:rPr>
+        <w:t>مدرس برنامه‌نویسی</w:t>
+      </w:r>
+    </w:p>
+    <w:p>
+      <w:pPr>
+        <w:keepLines/>
+        <w:bidi/>
+        <w:spacing w:after="140" w:line="315" w:lineRule="exact"/>
+      </w:pPr>
+      <w:r>
+        <w:rPr>
+          <w:rFonts w:eastAsia="Vazirmatn" w:cs="Vazirmatn"/>
+          <w:color w:val="334155"/>
+          <w:sz w:val="21"/>
+          <w:szCs w:val="21"/>
+          <w:rtl/>
+          <w:lang w:val="fa-IR" w:bidi="fa-IR"/>
+        </w:rPr>
+        <w:t>آموزشگاه نت‌کالج · یک سال</w:t>
+      </w:r>
+    </w:p>
+    <w:p>
+      <w:pPr>
+        <w:keepNext/>
+        <w:keepLines/>
+        <w:bidi/>
+        <w:spacing w:after="40" w:line="345" w:lineRule="exact"/>
+      </w:pPr>
+      <w:r>
+        <w:rPr>
+          <w:rFonts w:eastAsia="Vazirmatn" w:cs="Vazirmatn"/>
+          <w:b/>
+          <w:bCs/>
+          <w:color w:val="17212B"/>
+          <w:szCs w:val="23"/>
+          <w:rtl/>
+          <w:lang w:val="fa-IR" w:bidi="fa-IR"/>
+        </w:rPr>
+        <w:t>مدرس رباتیک</w:t>
+      </w:r>
+    </w:p>
+    <w:p>
+      <w:pPr>
+        <w:keepLines/>
+        <w:bidi/>
+        <w:spacing w:after="140" w:line="315" w:lineRule="exact"/>
+      </w:pPr>
+      <w:r>
+        <w:rPr>
+          <w:rFonts w:eastAsia="Vazirmatn" w:cs="Vazirmatn"/>
+          <w:color w:val="334155"/>
+          <w:sz w:val="21"/>
+          <w:szCs w:val="21"/>
+          <w:rtl/>
+          <w:lang w:val="fa-IR" w:bidi="fa-IR"/>
+        </w:rPr>
+        <w:t>آموزشگاه مهندسین برتر · یک سال</w:t>
+      </w:r>
+    </w:p>
+    <w:p>
+      <w:pPr>
+        <w:pStyle w:val="Heading1"/>
+        <w:bidi/>
+        <w:spacing w:before="180" w:after="100" w:line="405" w:lineRule="exact"/>
+      </w:pPr>
+      <w:r>
+        <w:rPr>
+          <w:rFonts w:ascii="Vazirmatn" w:eastAsia="Vazirmatn" w:hAnsi="Vazirmatn" w:cs="Vazirmatn"/>
+          <w:sz w:val="27"/>
+          <w:szCs w:val="27"/>
+          <w:rtl/>
+          <w:lang w:val="fa-IR" w:bidi="fa-IR"/>
+        </w:rPr>
+        <w:t>تحصیلات</w:t>
+      </w:r>
+    </w:p>
+    <w:p>
+      <w:pPr>
+        <w:keepNext/>
+        <w:keepLines/>
+        <w:bidi/>
+        <w:spacing w:after="40" w:line="345" w:lineRule="exact"/>
+      </w:pPr>
+      <w:r>
+        <w:rPr>
+          <w:rFonts w:eastAsia="Vazirmatn" w:cs="Vazirmatn"/>
+          <w:b/>
+          <w:bCs/>
+          <w:color w:val="17212B"/>
+          <w:szCs w:val="23"/>
+          <w:rtl/>
+          <w:lang w:val="fa-IR" w:bidi="fa-IR"/>
+        </w:rPr>
+        <w:t>کارشناسی ارشد هوش مصنوعی</w:t>
+      </w:r>
+    </w:p>
+    <w:p>
+      <w:pPr>
+        <w:keepNext/>
+        <w:keepLines/>
+        <w:bidi/>
+        <w:spacing w:after="60" w:line="315" w:lineRule="exact"/>
+      </w:pPr>
+      <w:r>
+        <w:rPr>
+          <w:rFonts w:eastAsia="Vazirmatn" w:cs="Vazirmatn"/>
+          <w:color w:val="334155"/>
+          <w:sz w:val="21"/>
+          <w:szCs w:val="21"/>
+          <w:rtl/>
+          <w:lang w:val="fa-IR" w:bidi="fa-IR"/>
+        </w:rPr>
+        <w:t>دانشگاه آزاد اسلامی واحد کرج</w:t>
+      </w:r>
+    </w:p>
+    <w:p>
+      <w:pPr>
+        <w:keepNext/>
+        <w:keepLines/>
+        <w:bidi/>
+        <w:spacing w:after="80" w:line="345" w:lineRule="exact"/>
+      </w:pPr>
+      <w:r>
+        <w:rPr>
+          <w:rFonts w:eastAsia="Vazirmatn" w:cs="Vazirmatn"/>
+          <w:color w:val="17212B"/>
+          <w:szCs w:val="23"/>
+          <w:rtl/>
+          <w:lang w:val="fa-IR" w:bidi="fa-IR"/>
+        </w:rPr>
+        <w:t>۱۴۰۳ تا ۱۴۰۵ (پیش‌بینی‌شده)، آماده دفاع از پایان‌نامه</w:t>
+      </w:r>
+    </w:p>
+    <w:p>
+      <w:pPr>
+        <w:keepNext/>
+        <w:keepLines/>
+        <w:bidi/>
+        <w:spacing w:after="80" w:line="345" w:lineRule="exact"/>
+      </w:pPr>
+      <w:r>
+        <w:rPr>
+          <w:rFonts w:eastAsia="Vazirmatn" w:cs="Vazirmatn"/>
+          <w:color w:val="17212B"/>
+          <w:szCs w:val="23"/>
+          <w:rtl/>
+          <w:lang w:val="fa-IR" w:bidi="fa-IR"/>
+        </w:rPr>
+        <w:t>معدل: ۱۸٫۴۵ از ۲۰</w:t>
+      </w:r>
+    </w:p>
+    <w:p>
+      <w:pPr>
+        <w:keepLines/>
+        <w:bidi/>
+        <w:spacing w:after="140" w:line="345" w:lineRule="exact"/>
+      </w:pPr>
+      <w:r>
+        <w:rPr>
+          <w:rFonts w:eastAsia="Vazirmatn" w:cs="Vazirmatn"/>
+          <w:color w:val="17212B"/>
+          <w:szCs w:val="23"/>
+          <w:rtl/>
+          <w:lang w:val="fa-IR" w:bidi="fa-IR"/>
+        </w:rPr>
+        <w:t>موضوع پایان‌نامه: بهبود دقت لب‌خوانی با شبکه‌های عصبی عمیق.</w:t>
+      </w:r>
+    </w:p>
+    <w:p>
+      <w:pPr>
+        <w:keepNext/>
+        <w:keepLines/>
+        <w:bidi/>
+        <w:spacing w:after="40" w:line="345" w:lineRule="exact"/>
+      </w:pPr>
+      <w:r>
+        <w:rPr>
+          <w:rFonts w:eastAsia="Vazirmatn" w:cs="Vazirmatn"/>
+          <w:b/>
+          <w:bCs/>
+          <w:color w:val="17212B"/>
+          <w:szCs w:val="23"/>
+          <w:rtl/>
+          <w:lang w:val="fa-IR" w:bidi="fa-IR"/>
+        </w:rPr>
+        <w:t>کارشناسی علوم کامپیوتر (مهندسی نرم‌افزار)</w:t>
+      </w:r>
+    </w:p>
+    <w:p>
+      <w:pPr>
+        <w:keepNext/>
+        <w:keepLines/>
+        <w:bidi/>
+        <w:spacing w:after="60" w:line="315" w:lineRule="exact"/>
+      </w:pPr>
+      <w:r>
+        <w:rPr>
+          <w:rFonts w:eastAsia="Vazirmatn" w:cs="Vazirmatn"/>
+          <w:color w:val="334155"/>
+          <w:sz w:val="21"/>
+          <w:szCs w:val="21"/>
+          <w:rtl/>
+          <w:lang w:val="fa-IR" w:bidi="fa-IR"/>
+        </w:rPr>
+        <w:t>دانشگاه آزاد اسلامی واحد کرج</w:t>
+      </w:r>
+    </w:p>
+    <w:p>
+      <w:pPr>
+        <w:keepNext/>
+        <w:keepLines/>
+        <w:bidi/>
+        <w:spacing w:after="80" w:line="345" w:lineRule="exact"/>
+      </w:pPr>
+      <w:r>
+        <w:rPr>
+          <w:rFonts w:eastAsia="Vazirmatn" w:cs="Vazirmatn"/>
+          <w:color w:val="17212B"/>
+          <w:szCs w:val="23"/>
+          <w:rtl/>
+          <w:lang w:val="fa-IR" w:bidi="fa-IR"/>
+        </w:rPr>
+        <w:t>۱۳۹۶ تا ۱۴۰۲</w:t>
+      </w:r>
+    </w:p>
+    <w:p>
+      <w:pPr>
+        <w:keepLines/>
+        <w:bidi/>
+        <w:spacing w:after="140" w:line="345" w:lineRule="exact"/>
+      </w:pPr>
+      <w:r>
+        <w:rPr>
+          <w:rFonts w:eastAsia="Vazirmatn" w:cs="Vazirmatn"/>
+          <w:color w:val="17212B"/>
+          <w:szCs w:val="23"/>
+          <w:rtl/>
+          <w:lang w:val="fa-IR" w:bidi="fa-IR"/>
+        </w:rPr>
+        <w:t>معدل: ۱۴٫۶۸ از ۲۰</w:t>
+      </w:r>
+    </w:p>
+    <w:p>
+      <w:pPr>
+        <w:pStyle w:val="Heading1"/>
+        <w:bidi/>
+        <w:spacing w:before="180" w:after="100" w:line="405" w:lineRule="exact"/>
+      </w:pPr>
+      <w:r>
+        <w:rPr>
+          <w:rFonts w:ascii="Vazirmatn" w:eastAsia="Vazirmatn" w:hAnsi="Vazirmatn" w:cs="Vazirmatn"/>
+          <w:sz w:val="27"/>
+          <w:szCs w:val="27"/>
           <w:rtl/>
           <w:lang w:val="fa-IR" w:bidi="fa-IR"/>
         </w:rPr>
@@ -353,48 +1116,54 @@
     </w:p>
     <w:p>
       <w:pPr>
+        <w:keepNext/>
         <w:keepLines/>
         <w:bidi/>
-        <w:rPr>
-          <w:rFonts w:hint="eastAsia"/>
-        </w:rPr>
+        <w:spacing w:after="40" w:line="345" w:lineRule="exact"/>
       </w:pPr>
       <w:r>
         <w:rPr>
-          <w:rFonts w:cs="Tahoma"/>
+          <w:rFonts w:eastAsia="Vazirmatn" w:cs="Vazirmatn"/>
           <w:b/>
           <w:bCs/>
-          <w:color w:val="1B2C3B"/>
-          <w:szCs w:val="21"/>
+          <w:color w:val="17212B"/>
+          <w:szCs w:val="23"/>
           <w:rtl/>
           <w:lang w:val="fa-IR" w:bidi="fa-IR"/>
         </w:rPr>
         <w:t>هم‌بنیان‌گذار</w:t>
       </w:r>
+    </w:p>
+    <w:p>
+      <w:pPr>
+        <w:keepNext/>
+        <w:keepLines/>
+        <w:bidi/>
+        <w:spacing w:after="60" w:line="315" w:lineRule="exact"/>
+      </w:pPr>
       <w:r>
         <w:rPr>
-          <w:rFonts w:cs="Tahoma"/>
-          <w:color w:val="1B2C3B"/>
+          <w:rFonts w:eastAsia="Vazirmatn" w:cs="Vazirmatn"/>
+          <w:color w:val="334155"/>
+          <w:sz w:val="21"/>
           <w:szCs w:val="21"/>
           <w:rtl/>
           <w:lang w:val="fa-IR" w:bidi="fa-IR"/>
         </w:rPr>
-        <w:t xml:space="preserve"> | فیدار تکنولوژی فرتاک | یک‌ونیم سال</w:t>
+        <w:t>فیدار تکنولوژی فرتاک · یک‌ونیم سال</w:t>
       </w:r>
     </w:p>
     <w:p>
       <w:pPr>
         <w:keepLines/>
         <w:bidi/>
-        <w:rPr>
-          <w:rFonts w:hint="eastAsia"/>
-        </w:rPr>
+        <w:spacing w:after="140" w:line="345" w:lineRule="exact"/>
       </w:pPr>
       <w:r>
         <w:rPr>
-          <w:rFonts w:cs="Tahoma"/>
-          <w:color w:val="1B2C3B"/>
-          <w:szCs w:val="21"/>
+          <w:rFonts w:eastAsia="Vazirmatn" w:cs="Vazirmatn"/>
+          <w:color w:val="17212B"/>
+          <w:szCs w:val="23"/>
           <w:rtl/>
           <w:lang w:val="fa-IR" w:bidi="fa-IR"/>
         </w:rPr>
@@ -405,585 +1174,13 @@
       <w:pPr>
         <w:pStyle w:val="Heading1"/>
         <w:bidi/>
+        <w:spacing w:before="180" w:after="100" w:line="405" w:lineRule="exact"/>
       </w:pPr>
       <w:r>
         <w:rPr>
-          <w:rFonts w:ascii="Tahoma" w:hAnsi="Tahoma" w:cs="Tahoma"/>
-          <w:color w:val="1B2C3B"/>
-          <w:szCs w:val="23"/>
-          <w:rtl/>
-          <w:lang w:val="fa-IR" w:bidi="fa-IR"/>
-        </w:rPr>
-        <w:t>پروژه‌های منتخب</w:t>
-      </w:r>
-    </w:p>
-    <w:p>
-      <w:pPr>
-        <w:keepLines/>
-        <w:bidi/>
-        <w:rPr>
-          <w:rFonts w:hint="eastAsia"/>
-        </w:rPr>
-      </w:pPr>
-      <w:r>
-        <w:rPr>
-          <w:rFonts w:ascii="Arial" w:hAnsi="Arial" w:cs="Tahoma"/>
-          <w:b/>
-          <w:bCs/>
-          <w:color w:val="1B2C3B"/>
-          <w:szCs w:val="21"/>
-          <w:lang w:bidi="fa-IR"/>
-        </w:rPr>
-        <w:t>EGOSD</w:t>
-      </w:r>
-      <w:r>
-        <w:rPr>
-          <w:rFonts w:cs="Tahoma"/>
-          <w:color w:val="1B2C3B"/>
-          <w:szCs w:val="21"/>
-          <w:rtl/>
-          <w:lang w:val="fa-IR" w:bidi="fa-IR"/>
-        </w:rPr>
-        <w:t xml:space="preserve"> | خودتقطیری مبتنی بر عدم قطعیت برای </w:t>
-      </w:r>
-      <w:r>
-        <w:rPr>
-          <w:rFonts w:ascii="Arial" w:hAnsi="Arial" w:cs="Tahoma"/>
-          <w:color w:val="1B2C3B"/>
-          <w:szCs w:val="21"/>
-          <w:lang w:bidi="fa-IR"/>
-        </w:rPr>
-        <w:t>VSR.</w:t>
-      </w:r>
-      <w:r>
-        <w:rPr>
-          <w:rFonts w:cs="Tahoma"/>
-          <w:color w:val="1B2C3B"/>
-          <w:szCs w:val="21"/>
-          <w:rtl/>
-          <w:lang w:val="fa-IR" w:bidi="fa-IR"/>
-        </w:rPr>
-        <w:t xml:space="preserve"> آموزش و اجرای مدل روی </w:t>
-      </w:r>
-      <w:r>
-        <w:rPr>
-          <w:rFonts w:ascii="Arial" w:hAnsi="Arial" w:cs="Tahoma"/>
-          <w:color w:val="1B2C3B"/>
-          <w:szCs w:val="21"/>
-          <w:lang w:bidi="fa-IR"/>
-        </w:rPr>
-        <w:t>GPU.</w:t>
-      </w:r>
-      <w:r>
-        <w:rPr>
-          <w:rFonts w:cs="Tahoma"/>
-          <w:color w:val="1B2C3B"/>
-          <w:szCs w:val="21"/>
-          <w:rtl/>
-          <w:lang w:val="fa-IR" w:bidi="fa-IR"/>
-        </w:rPr>
-        <w:t xml:space="preserve"> در حال داوری در </w:t>
-      </w:r>
-      <w:r>
-        <w:rPr>
-          <w:rFonts w:ascii="Arial" w:hAnsi="Arial" w:cs="Tahoma"/>
-          <w:color w:val="1B2C3B"/>
-          <w:szCs w:val="21"/>
-          <w:lang w:bidi="fa-IR"/>
-        </w:rPr>
-        <w:t>The Visual Computer.</w:t>
-      </w:r>
-    </w:p>
-    <w:p>
-      <w:pPr>
-        <w:keepLines/>
-        <w:bidi/>
-        <w:rPr>
-          <w:rFonts w:hint="eastAsia"/>
-        </w:rPr>
-      </w:pPr>
-      <w:r>
-        <w:rPr>
-          <w:rFonts w:ascii="Arial" w:hAnsi="Arial" w:cs="Tahoma"/>
-          <w:b/>
-          <w:bCs/>
-          <w:color w:val="1B2C3B"/>
-          <w:szCs w:val="21"/>
-          <w:lang w:bidi="fa-IR"/>
-        </w:rPr>
-        <w:t>PyLipExtractor</w:t>
-      </w:r>
-      <w:r>
-        <w:rPr>
-          <w:rFonts w:cs="Tahoma"/>
-          <w:color w:val="1B2C3B"/>
-          <w:szCs w:val="21"/>
-          <w:rtl/>
-          <w:lang w:val="fa-IR" w:bidi="fa-IR"/>
-        </w:rPr>
-        <w:t xml:space="preserve"> | بسته متن‌باز استخراج ناحیه لب از ویدئو با هموارسازی زمانی و تنظیم اختیاری روشنایی.</w:t>
-      </w:r>
-    </w:p>
-    <w:p>
-      <w:pPr>
-        <w:keepLines/>
-        <w:rPr>
-          <w:rFonts w:hint="eastAsia"/>
-        </w:rPr>
-      </w:pPr>
-      <w:r>
-        <w:rPr>
-          <w:rFonts w:ascii="Arial" w:hAnsi="Arial" w:cs="Tahoma"/>
-          <w:color w:val="1B2C3B"/>
-          <w:szCs w:val="21"/>
-          <w:lang w:bidi="fa-IR"/>
-        </w:rPr>
-        <w:t>https://github.com/MehradYaghoubi/pylipextractor</w:t>
-      </w:r>
-    </w:p>
-    <w:p>
-      <w:pPr>
-        <w:keepLines/>
-        <w:bidi/>
-        <w:rPr>
-          <w:rFonts w:hint="eastAsia"/>
-        </w:rPr>
-      </w:pPr>
-      <w:r>
-        <w:rPr>
-          <w:rFonts w:cs="Tahoma"/>
-          <w:b/>
-          <w:bCs/>
-          <w:color w:val="1B2C3B"/>
-          <w:szCs w:val="21"/>
-          <w:rtl/>
-          <w:lang w:val="fa-IR" w:bidi="fa-IR"/>
-        </w:rPr>
-        <w:t>شوفاژ یعقوبی</w:t>
-      </w:r>
-      <w:r>
-        <w:rPr>
-          <w:rFonts w:cs="Tahoma"/>
-          <w:color w:val="1B2C3B"/>
-          <w:szCs w:val="21"/>
-          <w:rtl/>
-          <w:lang w:val="fa-IR" w:bidi="fa-IR"/>
-        </w:rPr>
-        <w:t xml:space="preserve"> | توسعه وب‌سایت خدماتی و فروشگاهی در زمینه تجهیزات گرمایشی.</w:t>
-      </w:r>
-    </w:p>
-    <w:p>
-      <w:pPr>
-        <w:keepLines/>
-        <w:bidi/>
-        <w:rPr>
-          <w:rFonts w:hint="eastAsia"/>
-        </w:rPr>
-      </w:pPr>
-      <w:r>
-        <w:rPr>
-          <w:rFonts w:cs="Tahoma"/>
-          <w:b/>
-          <w:bCs/>
-          <w:color w:val="1B2C3B"/>
-          <w:szCs w:val="21"/>
-          <w:rtl/>
-          <w:lang w:val="fa-IR" w:bidi="fa-IR"/>
-        </w:rPr>
-        <w:t xml:space="preserve">ابزار </w:t>
-      </w:r>
-      <w:r>
-        <w:rPr>
-          <w:rFonts w:ascii="Arial" w:hAnsi="Arial" w:cs="Tahoma"/>
-          <w:b/>
-          <w:bCs/>
-          <w:color w:val="1B2C3B"/>
-          <w:szCs w:val="21"/>
-          <w:lang w:bidi="fa-IR"/>
-        </w:rPr>
-        <w:t>OCR</w:t>
-      </w:r>
-      <w:r>
-        <w:rPr>
-          <w:rFonts w:cs="Tahoma"/>
-          <w:color w:val="1B2C3B"/>
-          <w:szCs w:val="21"/>
-          <w:rtl/>
-          <w:lang w:val="fa-IR" w:bidi="fa-IR"/>
-        </w:rPr>
-        <w:t xml:space="preserve"> | تشخیص متن با استفاده از یک </w:t>
-      </w:r>
-      <w:r>
-        <w:rPr>
-          <w:rFonts w:ascii="Arial" w:hAnsi="Arial" w:cs="Tahoma"/>
-          <w:color w:val="1B2C3B"/>
-          <w:szCs w:val="21"/>
-          <w:lang w:bidi="fa-IR"/>
-        </w:rPr>
-        <w:t>API</w:t>
-      </w:r>
-      <w:r>
-        <w:rPr>
-          <w:rFonts w:cs="Tahoma"/>
-          <w:color w:val="1B2C3B"/>
-          <w:szCs w:val="21"/>
-          <w:rtl/>
-          <w:lang w:val="fa-IR" w:bidi="fa-IR"/>
-        </w:rPr>
-        <w:t xml:space="preserve"> خارجی.</w:t>
-      </w:r>
-    </w:p>
-    <w:p>
-      <w:pPr>
-        <w:keepLines/>
-        <w:bidi/>
-        <w:rPr>
-          <w:rFonts w:hint="eastAsia"/>
-        </w:rPr>
-      </w:pPr>
-      <w:r>
-        <w:rPr>
-          <w:rFonts w:cs="Tahoma"/>
-          <w:b/>
-          <w:bCs/>
-          <w:color w:val="1B2C3B"/>
-          <w:szCs w:val="21"/>
-          <w:rtl/>
-          <w:lang w:val="fa-IR" w:bidi="fa-IR"/>
-        </w:rPr>
-        <w:t xml:space="preserve">چت‌بات شخصی </w:t>
-      </w:r>
-      <w:r>
-        <w:rPr>
-          <w:rFonts w:ascii="Arial" w:hAnsi="Arial" w:cs="Tahoma"/>
-          <w:b/>
-          <w:bCs/>
-          <w:color w:val="1B2C3B"/>
-          <w:szCs w:val="21"/>
-          <w:lang w:bidi="fa-IR"/>
-        </w:rPr>
-        <w:t>RAG</w:t>
-      </w:r>
-      <w:r>
-        <w:rPr>
-          <w:rFonts w:cs="Tahoma"/>
-          <w:color w:val="1B2C3B"/>
-          <w:szCs w:val="21"/>
-          <w:rtl/>
-          <w:lang w:val="fa-IR" w:bidi="fa-IR"/>
-        </w:rPr>
-        <w:t xml:space="preserve"> | در دست توسعه.</w:t>
-      </w:r>
-    </w:p>
-    <w:p>
-      <w:pPr>
-        <w:pStyle w:val="Heading1"/>
-        <w:bidi/>
-      </w:pPr>
-      <w:r>
-        <w:rPr>
-          <w:rFonts w:ascii="Tahoma" w:hAnsi="Tahoma" w:cs="Tahoma"/>
-          <w:color w:val="1B2C3B"/>
-          <w:szCs w:val="23"/>
-          <w:rtl/>
-          <w:lang w:val="fa-IR" w:bidi="fa-IR"/>
-        </w:rPr>
-        <w:t>پژوهش و تدریس</w:t>
-      </w:r>
-    </w:p>
-    <w:p>
-      <w:pPr>
-        <w:keepLines/>
-        <w:bidi/>
-        <w:rPr>
-          <w:rFonts w:hint="eastAsia"/>
-        </w:rPr>
-      </w:pPr>
-      <w:r>
-        <w:rPr>
-          <w:rFonts w:cs="Tahoma"/>
-          <w:b/>
-          <w:bCs/>
-          <w:color w:val="1B2C3B"/>
-          <w:szCs w:val="21"/>
-          <w:rtl/>
-          <w:lang w:val="fa-IR" w:bidi="fa-IR"/>
-        </w:rPr>
-        <w:t>فعالیت پژوهشی</w:t>
-      </w:r>
-      <w:r>
-        <w:rPr>
-          <w:rFonts w:cs="Tahoma"/>
-          <w:color w:val="1B2C3B"/>
-          <w:szCs w:val="21"/>
-          <w:rtl/>
-          <w:lang w:val="fa-IR" w:bidi="fa-IR"/>
-        </w:rPr>
-        <w:t xml:space="preserve"> | مرکز تحقیقات دانشگاه آزاد اسلامی واحد کرج | یک‌ونیم سال</w:t>
-      </w:r>
-    </w:p>
-    <w:p>
-      <w:pPr>
-        <w:keepLines/>
-        <w:bidi/>
-        <w:rPr>
-          <w:rFonts w:hint="eastAsia"/>
-        </w:rPr>
-      </w:pPr>
-      <w:r>
-        <w:rPr>
-          <w:rFonts w:cs="Tahoma"/>
-          <w:b/>
-          <w:bCs/>
-          <w:color w:val="1B2C3B"/>
-          <w:szCs w:val="21"/>
-          <w:rtl/>
-          <w:lang w:val="fa-IR" w:bidi="fa-IR"/>
-        </w:rPr>
-        <w:t>مدرس رشته نرم‌افزار</w:t>
-      </w:r>
-      <w:r>
-        <w:rPr>
-          <w:rFonts w:cs="Tahoma"/>
-          <w:color w:val="1B2C3B"/>
-          <w:szCs w:val="21"/>
-          <w:rtl/>
-          <w:lang w:val="fa-IR" w:bidi="fa-IR"/>
-        </w:rPr>
-        <w:t xml:space="preserve"> | دانشکده کار و مهارت دانشگاه آزاد اسلامی واحد کرج | یک سال</w:t>
-      </w:r>
-    </w:p>
-    <w:p>
-      <w:pPr>
-        <w:keepLines/>
-        <w:bidi/>
-        <w:rPr>
-          <w:rFonts w:hint="eastAsia"/>
-        </w:rPr>
-      </w:pPr>
-      <w:r>
-        <w:rPr>
-          <w:rFonts w:cs="Tahoma"/>
-          <w:b/>
-          <w:bCs/>
-          <w:color w:val="1B2C3B"/>
-          <w:szCs w:val="21"/>
-          <w:rtl/>
-          <w:lang w:val="fa-IR" w:bidi="fa-IR"/>
-        </w:rPr>
-        <w:t>مدرس برنامه‌نویسی</w:t>
-      </w:r>
-      <w:r>
-        <w:rPr>
-          <w:rFonts w:cs="Tahoma"/>
-          <w:color w:val="1B2C3B"/>
-          <w:szCs w:val="21"/>
-          <w:rtl/>
-          <w:lang w:val="fa-IR" w:bidi="fa-IR"/>
-        </w:rPr>
-        <w:t xml:space="preserve"> | آموزشگاه نت‌کالج | یک سال</w:t>
-      </w:r>
-    </w:p>
-    <w:p>
-      <w:pPr>
-        <w:keepLines/>
-        <w:bidi/>
-        <w:rPr>
-          <w:rFonts w:hint="eastAsia"/>
-        </w:rPr>
-      </w:pPr>
-      <w:r>
-        <w:rPr>
-          <w:rFonts w:cs="Tahoma"/>
-          <w:b/>
-          <w:bCs/>
-          <w:color w:val="1B2C3B"/>
-          <w:szCs w:val="21"/>
-          <w:rtl/>
-          <w:lang w:val="fa-IR" w:bidi="fa-IR"/>
-        </w:rPr>
-        <w:t>مدرس رباتیک</w:t>
-      </w:r>
-      <w:r>
-        <w:rPr>
-          <w:rFonts w:cs="Tahoma"/>
-          <w:color w:val="1B2C3B"/>
-          <w:szCs w:val="21"/>
-          <w:rtl/>
-          <w:lang w:val="fa-IR" w:bidi="fa-IR"/>
-        </w:rPr>
-        <w:t xml:space="preserve"> | آموزشگاه مهندسین برتر | یک سال</w:t>
-      </w:r>
-    </w:p>
-    <w:p>
-      <w:pPr>
-        <w:pStyle w:val="Heading1"/>
-        <w:bidi/>
-      </w:pPr>
-      <w:r>
-        <w:rPr>
-          <w:rFonts w:ascii="Tahoma" w:hAnsi="Tahoma" w:cs="Tahoma"/>
-          <w:color w:val="1B2C3B"/>
-          <w:szCs w:val="23"/>
-          <w:rtl/>
-          <w:lang w:val="fa-IR" w:bidi="fa-IR"/>
-        </w:rPr>
-        <w:t>تحصیلات</w:t>
-      </w:r>
-    </w:p>
-    <w:p>
-      <w:pPr>
-        <w:keepLines/>
-        <w:bidi/>
-        <w:rPr>
-          <w:rFonts w:hint="eastAsia"/>
-        </w:rPr>
-      </w:pPr>
-      <w:r>
-        <w:rPr>
-          <w:rFonts w:cs="Tahoma"/>
-          <w:b/>
-          <w:bCs/>
-          <w:color w:val="1B2C3B"/>
-          <w:szCs w:val="21"/>
-          <w:rtl/>
-          <w:lang w:val="fa-IR" w:bidi="fa-IR"/>
-        </w:rPr>
-        <w:t>کارشناسی ارشد هوش مصنوعی</w:t>
-      </w:r>
-      <w:r>
-        <w:rPr>
-          <w:rFonts w:cs="Tahoma"/>
-          <w:color w:val="1B2C3B"/>
-          <w:szCs w:val="21"/>
-          <w:rtl/>
-          <w:lang w:val="fa-IR" w:bidi="fa-IR"/>
-        </w:rPr>
-        <w:t xml:space="preserve"> | دانشگاه آزاد اسلامی واحد کرج</w:t>
-      </w:r>
-    </w:p>
-    <w:p>
-      <w:pPr>
-        <w:keepLines/>
-        <w:bidi/>
-        <w:rPr>
-          <w:rFonts w:hint="eastAsia"/>
-        </w:rPr>
-      </w:pPr>
-      <w:r>
-        <w:rPr>
-          <w:rFonts w:cs="Tahoma"/>
-          <w:b/>
-          <w:bCs/>
-          <w:color w:val="1B2C3B"/>
-          <w:szCs w:val="21"/>
-          <w:rtl/>
-          <w:lang w:val="fa-IR" w:bidi="fa-IR"/>
-        </w:rPr>
-        <w:t>۱۴۰۳ تا ۱۴۰۵ (پیش‌بینی‌شده)، آماده دفاع از پایان‌نامه</w:t>
-      </w:r>
-      <w:r>
-        <w:rPr>
-          <w:rFonts w:cs="Tahoma"/>
-          <w:color w:val="1B2C3B"/>
-          <w:szCs w:val="21"/>
-          <w:rtl/>
-          <w:lang w:val="fa-IR" w:bidi="fa-IR"/>
-        </w:rPr>
-        <w:t xml:space="preserve"> | معدل: ۱۸٫۴۵ از ۲۰</w:t>
-      </w:r>
-    </w:p>
-    <w:p>
-      <w:pPr>
-        <w:keepLines/>
-        <w:bidi/>
-        <w:rPr>
-          <w:rFonts w:hint="eastAsia"/>
-        </w:rPr>
-      </w:pPr>
-      <w:r>
-        <w:rPr>
-          <w:rFonts w:cs="Tahoma"/>
-          <w:color w:val="1B2C3B"/>
-          <w:szCs w:val="21"/>
-          <w:rtl/>
-          <w:lang w:val="fa-IR" w:bidi="fa-IR"/>
-        </w:rPr>
-        <w:t>موضوع پایان‌نامه: بهبود دقت لب‌خوانی با شبکه‌های عصبی عمیق.</w:t>
-      </w:r>
-    </w:p>
-    <w:p>
-      <w:pPr>
-        <w:keepLines/>
-        <w:bidi/>
-        <w:rPr>
-          <w:rFonts w:hint="eastAsia"/>
-        </w:rPr>
-      </w:pPr>
-      <w:r>
-        <w:rPr>
-          <w:rFonts w:cs="Tahoma"/>
-          <w:b/>
-          <w:bCs/>
-          <w:color w:val="1B2C3B"/>
-          <w:szCs w:val="21"/>
-          <w:rtl/>
-          <w:lang w:val="fa-IR" w:bidi="fa-IR"/>
-        </w:rPr>
-        <w:t>کارشناسی علوم کامپیوتر (مهندسی نرم‌افزار)</w:t>
-      </w:r>
-      <w:r>
-        <w:rPr>
-          <w:rFonts w:cs="Tahoma"/>
-          <w:color w:val="1B2C3B"/>
-          <w:szCs w:val="21"/>
-          <w:rtl/>
-          <w:lang w:val="fa-IR" w:bidi="fa-IR"/>
-        </w:rPr>
-        <w:t xml:space="preserve"> | دانشگاه آزاد اسلامی واحد کرج</w:t>
-      </w:r>
-    </w:p>
-    <w:p>
-      <w:pPr>
-        <w:keepLines/>
-        <w:bidi/>
-        <w:rPr>
-          <w:rFonts w:hint="eastAsia"/>
-        </w:rPr>
-      </w:pPr>
-      <w:r>
-        <w:rPr>
-          <w:rFonts w:cs="Tahoma"/>
-          <w:b/>
-          <w:bCs/>
-          <w:color w:val="1B2C3B"/>
-          <w:szCs w:val="21"/>
-          <w:rtl/>
-          <w:lang w:val="fa-IR" w:bidi="fa-IR"/>
-        </w:rPr>
-        <w:t>۱۳۹۶ تا ۱۴۰۲</w:t>
-      </w:r>
-      <w:r>
-        <w:rPr>
-          <w:rFonts w:cs="Tahoma"/>
-          <w:color w:val="1B2C3B"/>
-          <w:szCs w:val="21"/>
-          <w:rtl/>
-          <w:lang w:val="fa-IR" w:bidi="fa-IR"/>
-        </w:rPr>
-        <w:t xml:space="preserve"> | معدل: ۱۴٫۶۸ از ۲۰</w:t>
-      </w:r>
-    </w:p>
-    <w:p>
-      <w:pPr>
-        <w:pStyle w:val="Heading1"/>
-        <w:bidi/>
-      </w:pPr>
-      <w:r>
-        <w:rPr>
-          <w:rFonts w:ascii="Tahoma" w:hAnsi="Tahoma" w:cs="Tahoma"/>
-          <w:color w:val="1B2C3B"/>
-          <w:szCs w:val="23"/>
+          <w:rFonts w:ascii="Vazirmatn" w:eastAsia="Vazirmatn" w:hAnsi="Vazirmatn" w:cs="Vazirmatn"/>
+          <w:sz w:val="27"/>
+          <w:szCs w:val="27"/>
           <w:rtl/>
           <w:lang w:val="fa-IR" w:bidi="fa-IR"/>
         </w:rPr>
@@ -994,34 +1191,39 @@
       <w:pPr>
         <w:keepLines/>
         <w:bidi/>
-        <w:rPr>
-          <w:rFonts w:hint="eastAsia"/>
-        </w:rPr>
+        <w:spacing w:after="100" w:line="345" w:lineRule="exact"/>
       </w:pPr>
       <w:r>
         <w:rPr>
-          <w:rFonts w:cs="Tahoma"/>
-          <w:color w:val="1B2C3B"/>
-          <w:szCs w:val="21"/>
+          <w:rFonts w:eastAsia="Vazirmatn" w:cs="Vazirmatn"/>
+          <w:color w:val="17212B"/>
+          <w:szCs w:val="23"/>
           <w:rtl/>
           <w:lang w:val="fa-IR" w:bidi="fa-IR"/>
         </w:rPr>
-        <w:t xml:space="preserve">فارسی (زبان مادری)، انگلیسی (سطح </w:t>
+        <w:t>فارسی، زبان مادری</w:t>
       </w:r>
+    </w:p>
+    <w:p>
+      <w:pPr>
+        <w:keepLines/>
+        <w:bidi/>
+        <w:spacing w:after="100" w:line="310" w:lineRule="exact"/>
+      </w:pPr>
       <w:r>
         <w:rPr>
-          <w:rFonts w:ascii="Arial" w:hAnsi="Arial" w:cs="Tahoma"/>
-          <w:color w:val="1B2C3B"/>
-          <w:szCs w:val="21"/>
-          <w:lang w:bidi="fa-IR"/>
+          <w:rFonts w:ascii="Arial" w:eastAsia="Arial" w:hAnsi="Arial" w:cs="Arial"/>
+          <w:color w:val="17212B"/>
+          <w:szCs w:val="23"/>
+          <w:lang w:bidi="en-US"/>
         </w:rPr>
-        <w:t>B1).</w:t>
+        <w:t>English · B1</w:t>
       </w:r>
     </w:p>
     <w:sectPr>
-      <w:footerReference w:type="default" r:id="rId8"/>
-      <w:pgSz w:w="11909" w:h="16834"/>
-      <w:pgMar w:top="835" w:right="979" w:bottom="835" w:left="979" w:header="720" w:footer="720" w:gutter="0"/>
+      <w:footerReference w:type="default" r:id="rId17"/>
+      <w:pgSz w:w="11906" w:h="16838"/>
+      <w:pgMar w:top="907" w:right="1020" w:bottom="907" w:left="1020" w:header="720" w:footer="454" w:gutter="0"/>
       <w:cols w:space="720"/>
       <w:docGrid w:linePitch="360"/>
     </w:sectPr>
@@ -1035,9 +1237,6 @@
     <w:p>
       <w:pPr>
         <w:spacing w:after="0" w:line="240" w:lineRule="auto"/>
-        <w:rPr>
-          <w:rFonts w:hint="eastAsia"/>
-        </w:rPr>
       </w:pPr>
       <w:r>
         <w:separator/>
@@ -1048,9 +1247,6 @@
     <w:p>
       <w:pPr>
         <w:spacing w:after="0" w:line="240" w:lineRule="auto"/>
-        <w:rPr>
-          <w:rFonts w:hint="eastAsia"/>
-        </w:rPr>
       </w:pPr>
       <w:r>
         <w:continuationSeparator/>
@@ -1066,18 +1262,16 @@
     <w:pPr>
       <w:pStyle w:val="Footer"/>
       <w:jc w:val="center"/>
-      <w:rPr>
-        <w:rFonts w:hint="eastAsia"/>
-      </w:rPr>
     </w:pPr>
     <w:r>
       <w:rPr>
-        <w:rFonts w:ascii="Arial" w:hAnsi="Arial" w:cs="Arial"/>
-        <w:color w:val="1B2C3B"/>
-        <w:sz w:val="16"/>
+        <w:rFonts w:ascii="Arial" w:eastAsia="Arial" w:hAnsi="Arial" w:cs="Arial"/>
+        <w:color w:val="17212B"/>
+        <w:sz w:val="18"/>
+        <w:szCs w:val="18"/>
         <w:lang w:bidi="en-US"/>
       </w:rPr>
-      <w:t xml:space="preserve">Mehrad Yaghoubi | </w:t>
+      <w:t xml:space="preserve">Mehrad Yaghoubi  ·  </w:t>
     </w:r>
     <w:r>
       <w:fldChar w:fldCharType="begin"/>
@@ -1086,9 +1280,6 @@
       <w:instrText>PAGE</w:instrText>
     </w:r>
     <w:r>
-      <w:rPr>
-        <w:rFonts w:hint="eastAsia"/>
-      </w:rPr>
       <w:fldChar w:fldCharType="separate"/>
     </w:r>
     <w:r>
@@ -1102,9 +1293,10 @@
     </w:r>
     <w:r>
       <w:rPr>
-        <w:rFonts w:ascii="Arial" w:hAnsi="Arial" w:cs="Arial"/>
-        <w:color w:val="1B2C3B"/>
-        <w:sz w:val="16"/>
+        <w:rFonts w:ascii="Arial" w:eastAsia="Arial" w:hAnsi="Arial" w:cs="Arial"/>
+        <w:color w:val="17212B"/>
+        <w:sz w:val="18"/>
+        <w:szCs w:val="18"/>
         <w:lang w:bidi="en-US"/>
       </w:rPr>
       <w:t xml:space="preserve"> / </w:t>
@@ -1116,16 +1308,13 @@
       <w:instrText>NUMPAGES</w:instrText>
     </w:r>
     <w:r>
-      <w:rPr>
-        <w:rFonts w:hint="eastAsia"/>
-      </w:rPr>
       <w:fldChar w:fldCharType="separate"/>
     </w:r>
     <w:r>
       <w:rPr>
         <w:noProof/>
       </w:rPr>
-      <w:t>1</w:t>
+      <w:t>2</w:t>
     </w:r>
     <w:r>
       <w:fldChar w:fldCharType="end"/>
@@ -1140,9 +1329,6 @@
     <w:p>
       <w:pPr>
         <w:spacing w:after="0" w:line="240" w:lineRule="auto"/>
-        <w:rPr>
-          <w:rFonts w:hint="eastAsia"/>
-        </w:rPr>
       </w:pPr>
       <w:r>
         <w:separator/>
@@ -1153,9 +1339,6 @@
     <w:p>
       <w:pPr>
         <w:spacing w:after="0" w:line="240" w:lineRule="auto"/>
-        <w:rPr>
-          <w:rFonts w:hint="eastAsia"/>
-        </w:rPr>
       </w:pPr>
       <w:r>
         <w:continuationSeparator/>
@@ -1338,31 +1521,31 @@
       </w:rPr>
     </w:lvl>
   </w:abstractNum>
-  <w:num w:numId="1" w16cid:durableId="208491475">
+  <w:num w:numId="1" w16cid:durableId="1267541004">
     <w:abstractNumId w:val="8"/>
   </w:num>
-  <w:num w:numId="2" w16cid:durableId="1317339583">
+  <w:num w:numId="2" w16cid:durableId="2057004954">
     <w:abstractNumId w:val="6"/>
   </w:num>
-  <w:num w:numId="3" w16cid:durableId="717978265">
+  <w:num w:numId="3" w16cid:durableId="889848567">
     <w:abstractNumId w:val="5"/>
   </w:num>
-  <w:num w:numId="4" w16cid:durableId="686448380">
+  <w:num w:numId="4" w16cid:durableId="2137797203">
     <w:abstractNumId w:val="4"/>
   </w:num>
-  <w:num w:numId="5" w16cid:durableId="31347204">
+  <w:num w:numId="5" w16cid:durableId="1942905789">
     <w:abstractNumId w:val="7"/>
   </w:num>
-  <w:num w:numId="6" w16cid:durableId="51512331">
+  <w:num w:numId="6" w16cid:durableId="7568404">
     <w:abstractNumId w:val="3"/>
   </w:num>
-  <w:num w:numId="7" w16cid:durableId="1734549343">
+  <w:num w:numId="7" w16cid:durableId="1699312733">
     <w:abstractNumId w:val="2"/>
   </w:num>
-  <w:num w:numId="8" w16cid:durableId="1333144396">
+  <w:num w:numId="8" w16cid:durableId="252472807">
     <w:abstractNumId w:val="1"/>
   </w:num>
-  <w:num w:numId="9" w16cid:durableId="431171495">
+  <w:num w:numId="9" w16cid:durableId="161510254">
     <w:abstractNumId w:val="0"/>
   </w:num>
 </w:numbering>
@@ -1758,12 +1941,9 @@
     <w:name w:val="Normal"/>
     <w:qFormat/>
     <w:rsid w:val="00FC693F"/>
-    <w:pPr>
-      <w:spacing w:after="40" w:line="271" w:lineRule="auto"/>
-    </w:pPr>
     <w:rPr>
-      <w:rFonts w:ascii="Tahoma" w:hAnsi="Tahoma"/>
-      <w:sz w:val="21"/>
+      <w:rFonts w:ascii="Vazirmatn" w:hAnsi="Vazirmatn"/>
+      <w:sz w:val="23"/>
     </w:rPr>
   </w:style>
   <w:style w:type="paragraph" w:styleId="Heading1">
@@ -1777,7 +1957,7 @@
     <w:pPr>
       <w:keepNext/>
       <w:keepLines/>
-      <w:spacing w:before="120" w:after="80"/>
+      <w:spacing w:before="480" w:after="0"/>
       <w:outlineLvl w:val="0"/>
     </w:pPr>
     <w:rPr>
@@ -1785,7 +1965,7 @@
       <w:b/>
       <w:bCs/>
       <w:color w:val="000000"/>
-      <w:sz w:val="23"/>
+      <w:sz w:val="28"/>
       <w:szCs w:val="28"/>
     </w:rPr>
   </w:style>
@@ -2107,7 +2287,7 @@
     <w:qFormat/>
     <w:rsid w:val="00FC693F"/>
     <w:pPr>
-      <w:spacing w:after="80" w:line="240" w:lineRule="auto"/>
+      <w:spacing w:after="300" w:line="240" w:lineRule="auto"/>
       <w:contextualSpacing/>
     </w:pPr>
     <w:rPr>
@@ -2115,7 +2295,7 @@
       <w:color w:val="000000"/>
       <w:spacing w:val="5"/>
       <w:kern w:val="28"/>
-      <w:sz w:val="46"/>
+      <w:sz w:val="52"/>
       <w:szCs w:val="52"/>
     </w:rPr>
   </w:style>

</xml_diff>

<commit_message>
Complete professional experience across bilingual work resumes
</commit_message>
<xml_diff>
--- a/public/resumes/Mehrad-Yaghoubi-AI-Engineering-Resume-FA.docx
+++ b/public/resumes/Mehrad-Yaghoubi-AI-Engineering-Resume-FA.docx
@@ -29,6 +29,9 @@
         <w:keepLines/>
         <w:bidi/>
         <w:spacing w:after="80" w:line="390" w:lineRule="exact"/>
+        <w:rPr>
+          <w:rFonts w:hint="eastAsia"/>
+        </w:rPr>
       </w:pPr>
       <w:r>
         <w:rPr>
@@ -50,6 +53,9 @@
         <w:keepLines/>
         <w:bidi/>
         <w:spacing w:after="60" w:line="283" w:lineRule="exact"/>
+        <w:rPr>
+          <w:rFonts w:hint="eastAsia"/>
+        </w:rPr>
       </w:pPr>
       <w:r>
         <w:rPr>
@@ -68,6 +74,9 @@
         <w:keepLines/>
         <w:bidi/>
         <w:spacing w:after="60" w:line="315" w:lineRule="exact"/>
+        <w:rPr>
+          <w:rFonts w:hint="eastAsia"/>
+        </w:rPr>
       </w:pPr>
       <w:r>
         <w:rPr>
@@ -86,6 +95,9 @@
         <w:keepLines/>
         <w:bidi/>
         <w:spacing w:after="80" w:line="345" w:lineRule="exact"/>
+        <w:rPr>
+          <w:rFonts w:hint="eastAsia"/>
+        </w:rPr>
       </w:pPr>
       <w:hyperlink r:id="rId8">
         <w:r>
@@ -128,6 +140,9 @@
         <w:keepLines/>
         <w:bidi/>
         <w:spacing w:after="140" w:line="345" w:lineRule="exact"/>
+        <w:rPr>
+          <w:rFonts w:hint="eastAsia"/>
+        </w:rPr>
       </w:pPr>
       <w:hyperlink r:id="rId10">
         <w:r>
@@ -211,6 +226,9 @@
         <w:keepLines/>
         <w:bidi/>
         <w:spacing w:after="100" w:line="345" w:lineRule="exact"/>
+        <w:rPr>
+          <w:rFonts w:hint="eastAsia"/>
+        </w:rPr>
       </w:pPr>
       <w:r>
         <w:rPr>
@@ -245,6 +263,9 @@
         <w:keepLines/>
         <w:bidi/>
         <w:spacing w:after="100" w:line="310" w:lineRule="exact"/>
+        <w:rPr>
+          <w:rFonts w:hint="eastAsia"/>
+        </w:rPr>
       </w:pPr>
       <w:r>
         <w:rPr>
@@ -261,6 +282,9 @@
         <w:keepLines/>
         <w:bidi/>
         <w:spacing w:after="100" w:line="310" w:lineRule="exact"/>
+        <w:rPr>
+          <w:rFonts w:hint="eastAsia"/>
+        </w:rPr>
       </w:pPr>
       <w:r>
         <w:rPr>
@@ -286,7 +310,7 @@
           <w:rtl/>
           <w:lang w:val="fa-IR" w:bidi="fa-IR"/>
         </w:rPr>
-        <w:t>سوابق کاری</w:t>
+        <w:t>سوابق حرفه‌ای</w:t>
       </w:r>
     </w:p>
     <w:p>
@@ -295,6 +319,9 @@
         <w:keepLines/>
         <w:bidi/>
         <w:spacing w:after="40" w:line="345" w:lineRule="exact"/>
+        <w:rPr>
+          <w:rFonts w:hint="eastAsia"/>
+        </w:rPr>
       </w:pPr>
       <w:r>
         <w:rPr>
@@ -315,6 +342,9 @@
         <w:keepLines/>
         <w:bidi/>
         <w:spacing w:after="60" w:line="315" w:lineRule="exact"/>
+        <w:rPr>
+          <w:rFonts w:hint="eastAsia"/>
+        </w:rPr>
       </w:pPr>
       <w:r>
         <w:rPr>
@@ -334,6 +364,9 @@
         <w:keepLines/>
         <w:bidi/>
         <w:spacing w:after="80" w:line="345" w:lineRule="exact"/>
+        <w:rPr>
+          <w:rFonts w:hint="eastAsia"/>
+        </w:rPr>
       </w:pPr>
       <w:r>
         <w:rPr>
@@ -361,6 +394,9 @@
         <w:keepLines/>
         <w:bidi/>
         <w:spacing w:after="80" w:line="345" w:lineRule="exact"/>
+        <w:rPr>
+          <w:rFonts w:hint="eastAsia"/>
+        </w:rPr>
       </w:pPr>
       <w:r>
         <w:rPr>
@@ -378,6 +414,9 @@
         <w:keepLines/>
         <w:bidi/>
         <w:spacing w:after="140" w:line="345" w:lineRule="exact"/>
+        <w:rPr>
+          <w:rFonts w:hint="eastAsia"/>
+        </w:rPr>
       </w:pPr>
       <w:r>
         <w:rPr>
@@ -392,7 +431,249 @@
     </w:p>
     <w:p>
       <w:pPr>
+        <w:keepNext/>
+        <w:keepLines/>
+        <w:bidi/>
+        <w:spacing w:after="40" w:line="345" w:lineRule="exact"/>
+        <w:rPr>
+          <w:rFonts w:hint="eastAsia"/>
+        </w:rPr>
+      </w:pPr>
+      <w:r>
+        <w:rPr>
+          <w:rFonts w:eastAsia="Vazirmatn" w:cs="Vazirmatn"/>
+          <w:b/>
+          <w:bCs/>
+          <w:color w:val="17212B"/>
+          <w:szCs w:val="23"/>
+          <w:rtl/>
+          <w:lang w:val="fa-IR" w:bidi="fa-IR"/>
+        </w:rPr>
+        <w:t>هم‌بنیان‌گذار</w:t>
+      </w:r>
+    </w:p>
+    <w:p>
+      <w:pPr>
+        <w:keepNext/>
+        <w:keepLines/>
+        <w:bidi/>
+        <w:spacing w:after="60" w:line="315" w:lineRule="exact"/>
+        <w:rPr>
+          <w:rFonts w:hint="eastAsia"/>
+        </w:rPr>
+      </w:pPr>
+      <w:r>
+        <w:rPr>
+          <w:rFonts w:eastAsia="Vazirmatn" w:cs="Vazirmatn"/>
+          <w:color w:val="334155"/>
+          <w:sz w:val="21"/>
+          <w:szCs w:val="21"/>
+          <w:rtl/>
+          <w:lang w:val="fa-IR" w:bidi="fa-IR"/>
+        </w:rPr>
+        <w:t>فیدار تکنولوژی فرتاک · یک‌ونیم سال</w:t>
+      </w:r>
+    </w:p>
+    <w:p>
+      <w:pPr>
+        <w:keepLines/>
+        <w:bidi/>
+        <w:spacing w:after="140" w:line="345" w:lineRule="exact"/>
+        <w:rPr>
+          <w:rFonts w:hint="eastAsia"/>
+        </w:rPr>
+      </w:pPr>
+      <w:r>
+        <w:rPr>
+          <w:rFonts w:eastAsia="Vazirmatn" w:cs="Vazirmatn"/>
+          <w:color w:val="17212B"/>
+          <w:szCs w:val="23"/>
+          <w:rtl/>
+          <w:lang w:val="fa-IR" w:bidi="fa-IR"/>
+        </w:rPr>
+        <w:t>طرح استارتاپی دانشگاهی برای توسعه بازی‌های مبتنی بر روان‌شناسی با هدف کمک به پیشگیری از جرم. این طرح به ثبت شرکت نرسید.</w:t>
+      </w:r>
+    </w:p>
+    <w:p>
+      <w:pPr>
+        <w:keepNext/>
+        <w:keepLines/>
+        <w:bidi/>
+        <w:spacing w:after="40" w:line="345" w:lineRule="exact"/>
+        <w:rPr>
+          <w:rFonts w:hint="eastAsia"/>
+        </w:rPr>
+      </w:pPr>
+      <w:r>
+        <w:rPr>
+          <w:rFonts w:eastAsia="Vazirmatn" w:cs="Vazirmatn"/>
+          <w:b/>
+          <w:bCs/>
+          <w:color w:val="17212B"/>
+          <w:szCs w:val="23"/>
+          <w:rtl/>
+          <w:lang w:val="fa-IR" w:bidi="fa-IR"/>
+        </w:rPr>
+        <w:t>فعالیت پژوهشی</w:t>
+      </w:r>
+    </w:p>
+    <w:p>
+      <w:pPr>
+        <w:keepLines/>
+        <w:bidi/>
+        <w:spacing w:after="140" w:line="315" w:lineRule="exact"/>
+        <w:rPr>
+          <w:rFonts w:hint="eastAsia"/>
+        </w:rPr>
+      </w:pPr>
+      <w:r>
+        <w:rPr>
+          <w:rFonts w:eastAsia="Vazirmatn" w:cs="Vazirmatn"/>
+          <w:color w:val="334155"/>
+          <w:sz w:val="21"/>
+          <w:szCs w:val="21"/>
+          <w:rtl/>
+          <w:lang w:val="fa-IR" w:bidi="fa-IR"/>
+        </w:rPr>
+        <w:t>مرکز تحقیقات دانشگاه آزاد اسلامی واحد کرج · یک‌ونیم سال</w:t>
+      </w:r>
+    </w:p>
+    <w:p>
+      <w:pPr>
+        <w:keepNext/>
+        <w:keepLines/>
+        <w:bidi/>
+        <w:spacing w:after="40" w:line="345" w:lineRule="exact"/>
+        <w:rPr>
+          <w:rFonts w:hint="eastAsia"/>
+        </w:rPr>
+      </w:pPr>
+      <w:r>
+        <w:rPr>
+          <w:rFonts w:eastAsia="Vazirmatn" w:cs="Vazirmatn"/>
+          <w:b/>
+          <w:bCs/>
+          <w:color w:val="17212B"/>
+          <w:szCs w:val="23"/>
+          <w:rtl/>
+          <w:lang w:val="fa-IR" w:bidi="fa-IR"/>
+        </w:rPr>
+        <w:t>مدرس رشته نرم‌افزار</w:t>
+      </w:r>
+    </w:p>
+    <w:p>
+      <w:pPr>
+        <w:keepLines/>
+        <w:bidi/>
+        <w:spacing w:after="140" w:line="315" w:lineRule="exact"/>
+        <w:rPr>
+          <w:rFonts w:hint="eastAsia"/>
+        </w:rPr>
+      </w:pPr>
+      <w:r>
+        <w:rPr>
+          <w:rFonts w:eastAsia="Vazirmatn" w:cs="Vazirmatn"/>
+          <w:color w:val="334155"/>
+          <w:sz w:val="21"/>
+          <w:szCs w:val="21"/>
+          <w:rtl/>
+          <w:lang w:val="fa-IR" w:bidi="fa-IR"/>
+        </w:rPr>
+        <w:t>دانشکده کار و مهارت دانشگاه آزاد اسلامی واحد کرج · یک سال</w:t>
+      </w:r>
+    </w:p>
+    <w:p>
+      <w:pPr>
+        <w:keepNext/>
+        <w:keepLines/>
+        <w:bidi/>
+        <w:spacing w:after="40" w:line="345" w:lineRule="exact"/>
+        <w:rPr>
+          <w:rFonts w:hint="eastAsia"/>
+        </w:rPr>
+      </w:pPr>
+      <w:r>
+        <w:rPr>
+          <w:rFonts w:eastAsia="Vazirmatn" w:cs="Vazirmatn"/>
+          <w:b/>
+          <w:bCs/>
+          <w:color w:val="17212B"/>
+          <w:szCs w:val="23"/>
+          <w:rtl/>
+          <w:lang w:val="fa-IR" w:bidi="fa-IR"/>
+        </w:rPr>
+        <w:t>مدرس برنامه‌نویسی</w:t>
+      </w:r>
+    </w:p>
+    <w:p>
+      <w:pPr>
+        <w:keepLines/>
+        <w:bidi/>
+        <w:spacing w:after="140" w:line="315" w:lineRule="exact"/>
+        <w:rPr>
+          <w:rFonts w:hint="eastAsia"/>
+        </w:rPr>
+      </w:pPr>
+      <w:r>
+        <w:rPr>
+          <w:rFonts w:eastAsia="Vazirmatn" w:cs="Vazirmatn"/>
+          <w:color w:val="334155"/>
+          <w:sz w:val="21"/>
+          <w:szCs w:val="21"/>
+          <w:rtl/>
+          <w:lang w:val="fa-IR" w:bidi="fa-IR"/>
+        </w:rPr>
+        <w:t>آموزشگاه نت‌کالج · یک سال</w:t>
+      </w:r>
+    </w:p>
+    <w:p>
+      <w:pPr>
+        <w:keepNext/>
+        <w:keepLines/>
+        <w:bidi/>
+        <w:spacing w:after="40" w:line="345" w:lineRule="exact"/>
+        <w:rPr>
+          <w:rFonts w:hint="eastAsia"/>
+        </w:rPr>
+      </w:pPr>
+      <w:r>
+        <w:rPr>
+          <w:rFonts w:eastAsia="Vazirmatn" w:cs="Vazirmatn"/>
+          <w:b/>
+          <w:bCs/>
+          <w:color w:val="17212B"/>
+          <w:szCs w:val="23"/>
+          <w:rtl/>
+          <w:lang w:val="fa-IR" w:bidi="fa-IR"/>
+        </w:rPr>
+        <w:t>مدرس رباتیک</w:t>
+      </w:r>
+    </w:p>
+    <w:p>
+      <w:pPr>
+        <w:keepLines/>
+        <w:bidi/>
+        <w:spacing w:after="140" w:line="315" w:lineRule="exact"/>
+        <w:rPr>
+          <w:rFonts w:hint="eastAsia"/>
+        </w:rPr>
+      </w:pPr>
+      <w:r>
+        <w:rPr>
+          <w:rFonts w:eastAsia="Vazirmatn" w:cs="Vazirmatn"/>
+          <w:color w:val="334155"/>
+          <w:sz w:val="21"/>
+          <w:szCs w:val="21"/>
+          <w:rtl/>
+          <w:lang w:val="fa-IR" w:bidi="fa-IR"/>
+        </w:rPr>
+        <w:t>آموزشگاه مهندسین برتر · یک سال</w:t>
+      </w:r>
+    </w:p>
+    <w:p>
+      <w:pPr>
         <w:pStyle w:val="Heading1"/>
+        <w:pageBreakBefore/>
         <w:bidi/>
         <w:spacing w:before="180" w:after="100" w:line="405" w:lineRule="exact"/>
       </w:pPr>
@@ -404,6 +685,7 @@
           <w:rtl/>
           <w:lang w:val="fa-IR" w:bidi="fa-IR"/>
         </w:rPr>
+        <w:lastRenderedPageBreak/>
         <w:t>پروژه‌های منتخب</w:t>
       </w:r>
     </w:p>
@@ -413,6 +695,9 @@
         <w:keepLines/>
         <w:bidi/>
         <w:spacing w:after="40" w:line="310" w:lineRule="exact"/>
+        <w:rPr>
+          <w:rFonts w:hint="eastAsia"/>
+        </w:rPr>
       </w:pPr>
       <w:r>
         <w:rPr>
@@ -432,6 +717,9 @@
         <w:keepLines/>
         <w:bidi/>
         <w:spacing w:after="80" w:line="345" w:lineRule="exact"/>
+        <w:rPr>
+          <w:rFonts w:hint="eastAsia"/>
+        </w:rPr>
       </w:pPr>
       <w:r>
         <w:rPr>
@@ -450,6 +738,9 @@
         <w:keepLines/>
         <w:bidi/>
         <w:spacing w:after="40" w:line="315" w:lineRule="exact"/>
+        <w:rPr>
+          <w:rFonts w:hint="eastAsia"/>
+        </w:rPr>
       </w:pPr>
       <w:r>
         <w:rPr>
@@ -469,6 +760,9 @@
         <w:keepLines/>
         <w:bidi/>
         <w:spacing w:after="60" w:line="283" w:lineRule="exact"/>
+        <w:rPr>
+          <w:rFonts w:hint="eastAsia"/>
+        </w:rPr>
       </w:pPr>
       <w:r>
         <w:rPr>
@@ -486,6 +780,9 @@
         <w:keepLines/>
         <w:bidi/>
         <w:spacing w:after="140" w:line="345" w:lineRule="exact"/>
+        <w:rPr>
+          <w:rFonts w:hint="eastAsia"/>
+        </w:rPr>
       </w:pPr>
       <w:hyperlink r:id="rId13">
         <w:r>
@@ -507,6 +804,9 @@
         <w:keepLines/>
         <w:bidi/>
         <w:spacing w:after="40" w:line="310" w:lineRule="exact"/>
+        <w:rPr>
+          <w:rFonts w:hint="eastAsia"/>
+        </w:rPr>
       </w:pPr>
       <w:r>
         <w:rPr>
@@ -526,6 +826,9 @@
         <w:keepLines/>
         <w:bidi/>
         <w:spacing w:after="80" w:line="345" w:lineRule="exact"/>
+        <w:rPr>
+          <w:rFonts w:hint="eastAsia"/>
+        </w:rPr>
       </w:pPr>
       <w:r>
         <w:rPr>
@@ -543,6 +846,9 @@
         <w:keepLines/>
         <w:bidi/>
         <w:spacing w:after="140" w:line="345" w:lineRule="exact"/>
+        <w:rPr>
+          <w:rFonts w:hint="eastAsia"/>
+        </w:rPr>
       </w:pPr>
       <w:hyperlink r:id="rId14">
         <w:r>
@@ -586,6 +892,9 @@
         <w:keepLines/>
         <w:bidi/>
         <w:spacing w:after="40" w:line="345" w:lineRule="exact"/>
+        <w:rPr>
+          <w:rFonts w:hint="eastAsia"/>
+        </w:rPr>
       </w:pPr>
       <w:r>
         <w:rPr>
@@ -606,6 +915,9 @@
         <w:keepLines/>
         <w:bidi/>
         <w:spacing w:after="80" w:line="345" w:lineRule="exact"/>
+        <w:rPr>
+          <w:rFonts w:hint="eastAsia"/>
+        </w:rPr>
       </w:pPr>
       <w:r>
         <w:rPr>
@@ -623,6 +935,9 @@
         <w:keepLines/>
         <w:bidi/>
         <w:spacing w:after="140" w:line="345" w:lineRule="exact"/>
+        <w:rPr>
+          <w:rFonts w:hint="eastAsia"/>
+        </w:rPr>
       </w:pPr>
       <w:hyperlink r:id="rId16">
         <w:r>
@@ -644,6 +959,9 @@
         <w:keepLines/>
         <w:bidi/>
         <w:spacing w:after="40" w:line="345" w:lineRule="exact"/>
+        <w:rPr>
+          <w:rFonts w:hint="eastAsia"/>
+        </w:rPr>
       </w:pPr>
       <w:r>
         <w:rPr>
@@ -663,6 +981,9 @@
         <w:keepLines/>
         <w:bidi/>
         <w:spacing w:after="140" w:line="345" w:lineRule="exact"/>
+        <w:rPr>
+          <w:rFonts w:hint="eastAsia"/>
+        </w:rPr>
       </w:pPr>
       <w:r>
         <w:rPr>
@@ -700,6 +1021,9 @@
         <w:keepLines/>
         <w:bidi/>
         <w:spacing w:after="40" w:line="345" w:lineRule="exact"/>
+        <w:rPr>
+          <w:rFonts w:hint="eastAsia"/>
+        </w:rPr>
       </w:pPr>
       <w:r>
         <w:rPr>
@@ -730,6 +1054,9 @@
         <w:keepLines/>
         <w:bidi/>
         <w:spacing w:after="140" w:line="315" w:lineRule="exact"/>
+        <w:rPr>
+          <w:rFonts w:hint="eastAsia"/>
+        </w:rPr>
       </w:pPr>
       <w:r>
         <w:rPr>
@@ -746,177 +1073,6 @@
     <w:p>
       <w:pPr>
         <w:pStyle w:val="Heading1"/>
-        <w:pageBreakBefore/>
-        <w:bidi/>
-        <w:spacing w:before="180" w:after="100" w:line="405" w:lineRule="exact"/>
-      </w:pPr>
-      <w:r>
-        <w:rPr>
-          <w:rFonts w:ascii="Vazirmatn" w:eastAsia="Vazirmatn" w:hAnsi="Vazirmatn" w:cs="Vazirmatn"/>
-          <w:sz w:val="27"/>
-          <w:szCs w:val="27"/>
-          <w:rtl/>
-          <w:lang w:val="fa-IR" w:bidi="fa-IR"/>
-        </w:rPr>
-        <w:lastRenderedPageBreak/>
-        <w:t>پژوهش و تدریس</w:t>
-      </w:r>
-    </w:p>
-    <w:p>
-      <w:pPr>
-        <w:keepNext/>
-        <w:keepLines/>
-        <w:bidi/>
-        <w:spacing w:after="40" w:line="345" w:lineRule="exact"/>
-      </w:pPr>
-      <w:r>
-        <w:rPr>
-          <w:rFonts w:eastAsia="Vazirmatn" w:cs="Vazirmatn"/>
-          <w:b/>
-          <w:bCs/>
-          <w:color w:val="17212B"/>
-          <w:szCs w:val="23"/>
-          <w:rtl/>
-          <w:lang w:val="fa-IR" w:bidi="fa-IR"/>
-        </w:rPr>
-        <w:t>فعالیت پژوهشی</w:t>
-      </w:r>
-    </w:p>
-    <w:p>
-      <w:pPr>
-        <w:keepLines/>
-        <w:bidi/>
-        <w:spacing w:after="140" w:line="315" w:lineRule="exact"/>
-      </w:pPr>
-      <w:r>
-        <w:rPr>
-          <w:rFonts w:eastAsia="Vazirmatn" w:cs="Vazirmatn"/>
-          <w:color w:val="334155"/>
-          <w:sz w:val="21"/>
-          <w:szCs w:val="21"/>
-          <w:rtl/>
-          <w:lang w:val="fa-IR" w:bidi="fa-IR"/>
-        </w:rPr>
-        <w:t>مرکز تحقیقات دانشگاه آزاد اسلامی واحد کرج · یک‌ونیم سال</w:t>
-      </w:r>
-    </w:p>
-    <w:p>
-      <w:pPr>
-        <w:keepNext/>
-        <w:keepLines/>
-        <w:bidi/>
-        <w:spacing w:after="40" w:line="345" w:lineRule="exact"/>
-      </w:pPr>
-      <w:r>
-        <w:rPr>
-          <w:rFonts w:eastAsia="Vazirmatn" w:cs="Vazirmatn"/>
-          <w:b/>
-          <w:bCs/>
-          <w:color w:val="17212B"/>
-          <w:szCs w:val="23"/>
-          <w:rtl/>
-          <w:lang w:val="fa-IR" w:bidi="fa-IR"/>
-        </w:rPr>
-        <w:t>مدرس رشته نرم‌افزار</w:t>
-      </w:r>
-    </w:p>
-    <w:p>
-      <w:pPr>
-        <w:keepLines/>
-        <w:bidi/>
-        <w:spacing w:after="140" w:line="315" w:lineRule="exact"/>
-      </w:pPr>
-      <w:r>
-        <w:rPr>
-          <w:rFonts w:eastAsia="Vazirmatn" w:cs="Vazirmatn"/>
-          <w:color w:val="334155"/>
-          <w:sz w:val="21"/>
-          <w:szCs w:val="21"/>
-          <w:rtl/>
-          <w:lang w:val="fa-IR" w:bidi="fa-IR"/>
-        </w:rPr>
-        <w:t>دانشکده کار و مهارت دانشگاه آزاد اسلامی واحد کرج · یک سال</w:t>
-      </w:r>
-    </w:p>
-    <w:p>
-      <w:pPr>
-        <w:keepNext/>
-        <w:keepLines/>
-        <w:bidi/>
-        <w:spacing w:after="40" w:line="345" w:lineRule="exact"/>
-      </w:pPr>
-      <w:r>
-        <w:rPr>
-          <w:rFonts w:eastAsia="Vazirmatn" w:cs="Vazirmatn"/>
-          <w:b/>
-          <w:bCs/>
-          <w:color w:val="17212B"/>
-          <w:szCs w:val="23"/>
-          <w:rtl/>
-          <w:lang w:val="fa-IR" w:bidi="fa-IR"/>
-        </w:rPr>
-        <w:t>مدرس برنامه‌نویسی</w:t>
-      </w:r>
-    </w:p>
-    <w:p>
-      <w:pPr>
-        <w:keepLines/>
-        <w:bidi/>
-        <w:spacing w:after="140" w:line="315" w:lineRule="exact"/>
-      </w:pPr>
-      <w:r>
-        <w:rPr>
-          <w:rFonts w:eastAsia="Vazirmatn" w:cs="Vazirmatn"/>
-          <w:color w:val="334155"/>
-          <w:sz w:val="21"/>
-          <w:szCs w:val="21"/>
-          <w:rtl/>
-          <w:lang w:val="fa-IR" w:bidi="fa-IR"/>
-        </w:rPr>
-        <w:t>آموزشگاه نت‌کالج · یک سال</w:t>
-      </w:r>
-    </w:p>
-    <w:p>
-      <w:pPr>
-        <w:keepNext/>
-        <w:keepLines/>
-        <w:bidi/>
-        <w:spacing w:after="40" w:line="345" w:lineRule="exact"/>
-      </w:pPr>
-      <w:r>
-        <w:rPr>
-          <w:rFonts w:eastAsia="Vazirmatn" w:cs="Vazirmatn"/>
-          <w:b/>
-          <w:bCs/>
-          <w:color w:val="17212B"/>
-          <w:szCs w:val="23"/>
-          <w:rtl/>
-          <w:lang w:val="fa-IR" w:bidi="fa-IR"/>
-        </w:rPr>
-        <w:t>مدرس رباتیک</w:t>
-      </w:r>
-    </w:p>
-    <w:p>
-      <w:pPr>
-        <w:keepLines/>
-        <w:bidi/>
-        <w:spacing w:after="140" w:line="315" w:lineRule="exact"/>
-      </w:pPr>
-      <w:r>
-        <w:rPr>
-          <w:rFonts w:eastAsia="Vazirmatn" w:cs="Vazirmatn"/>
-          <w:color w:val="334155"/>
-          <w:sz w:val="21"/>
-          <w:szCs w:val="21"/>
-          <w:rtl/>
-          <w:lang w:val="fa-IR" w:bidi="fa-IR"/>
-        </w:rPr>
-        <w:t>آموزشگاه مهندسین برتر · یک سال</w:t>
-      </w:r>
-    </w:p>
-    <w:p>
-      <w:pPr>
-        <w:pStyle w:val="Heading1"/>
         <w:bidi/>
         <w:spacing w:before="180" w:after="100" w:line="405" w:lineRule="exact"/>
       </w:pPr>
@@ -937,6 +1093,9 @@
         <w:keepLines/>
         <w:bidi/>
         <w:spacing w:after="40" w:line="345" w:lineRule="exact"/>
+        <w:rPr>
+          <w:rFonts w:hint="eastAsia"/>
+        </w:rPr>
       </w:pPr>
       <w:r>
         <w:rPr>
@@ -957,6 +1116,9 @@
         <w:keepLines/>
         <w:bidi/>
         <w:spacing w:after="60" w:line="315" w:lineRule="exact"/>
+        <w:rPr>
+          <w:rFonts w:hint="eastAsia"/>
+        </w:rPr>
       </w:pPr>
       <w:r>
         <w:rPr>
@@ -976,6 +1138,9 @@
         <w:keepLines/>
         <w:bidi/>
         <w:spacing w:after="80" w:line="345" w:lineRule="exact"/>
+        <w:rPr>
+          <w:rFonts w:hint="eastAsia"/>
+        </w:rPr>
       </w:pPr>
       <w:r>
         <w:rPr>
@@ -994,6 +1159,9 @@
         <w:keepLines/>
         <w:bidi/>
         <w:spacing w:after="80" w:line="345" w:lineRule="exact"/>
+        <w:rPr>
+          <w:rFonts w:hint="eastAsia"/>
+        </w:rPr>
       </w:pPr>
       <w:r>
         <w:rPr>
@@ -1011,6 +1179,9 @@
         <w:keepLines/>
         <w:bidi/>
         <w:spacing w:after="140" w:line="345" w:lineRule="exact"/>
+        <w:rPr>
+          <w:rFonts w:hint="eastAsia"/>
+        </w:rPr>
       </w:pPr>
       <w:r>
         <w:rPr>
@@ -1029,6 +1200,9 @@
         <w:keepLines/>
         <w:bidi/>
         <w:spacing w:after="40" w:line="345" w:lineRule="exact"/>
+        <w:rPr>
+          <w:rFonts w:hint="eastAsia"/>
+        </w:rPr>
       </w:pPr>
       <w:r>
         <w:rPr>
@@ -1049,6 +1223,9 @@
         <w:keepLines/>
         <w:bidi/>
         <w:spacing w:after="60" w:line="315" w:lineRule="exact"/>
+        <w:rPr>
+          <w:rFonts w:hint="eastAsia"/>
+        </w:rPr>
       </w:pPr>
       <w:r>
         <w:rPr>
@@ -1068,6 +1245,9 @@
         <w:keepLines/>
         <w:bidi/>
         <w:spacing w:after="80" w:line="345" w:lineRule="exact"/>
+        <w:rPr>
+          <w:rFonts w:hint="eastAsia"/>
+        </w:rPr>
       </w:pPr>
       <w:r>
         <w:rPr>
@@ -1085,6 +1265,9 @@
         <w:keepLines/>
         <w:bidi/>
         <w:spacing w:after="140" w:line="345" w:lineRule="exact"/>
+        <w:rPr>
+          <w:rFonts w:hint="eastAsia"/>
+        </w:rPr>
       </w:pPr>
       <w:r>
         <w:rPr>
@@ -1111,79 +1294,6 @@
           <w:rtl/>
           <w:lang w:val="fa-IR" w:bidi="fa-IR"/>
         </w:rPr>
-        <w:t>تجربه کارآفرینی</w:t>
-      </w:r>
-    </w:p>
-    <w:p>
-      <w:pPr>
-        <w:keepNext/>
-        <w:keepLines/>
-        <w:bidi/>
-        <w:spacing w:after="40" w:line="345" w:lineRule="exact"/>
-      </w:pPr>
-      <w:r>
-        <w:rPr>
-          <w:rFonts w:eastAsia="Vazirmatn" w:cs="Vazirmatn"/>
-          <w:b/>
-          <w:bCs/>
-          <w:color w:val="17212B"/>
-          <w:szCs w:val="23"/>
-          <w:rtl/>
-          <w:lang w:val="fa-IR" w:bidi="fa-IR"/>
-        </w:rPr>
-        <w:t>هم‌بنیان‌گذار</w:t>
-      </w:r>
-    </w:p>
-    <w:p>
-      <w:pPr>
-        <w:keepNext/>
-        <w:keepLines/>
-        <w:bidi/>
-        <w:spacing w:after="60" w:line="315" w:lineRule="exact"/>
-      </w:pPr>
-      <w:r>
-        <w:rPr>
-          <w:rFonts w:eastAsia="Vazirmatn" w:cs="Vazirmatn"/>
-          <w:color w:val="334155"/>
-          <w:sz w:val="21"/>
-          <w:szCs w:val="21"/>
-          <w:rtl/>
-          <w:lang w:val="fa-IR" w:bidi="fa-IR"/>
-        </w:rPr>
-        <w:t>فیدار تکنولوژی فرتاک · یک‌ونیم سال</w:t>
-      </w:r>
-    </w:p>
-    <w:p>
-      <w:pPr>
-        <w:keepLines/>
-        <w:bidi/>
-        <w:spacing w:after="140" w:line="345" w:lineRule="exact"/>
-      </w:pPr>
-      <w:r>
-        <w:rPr>
-          <w:rFonts w:eastAsia="Vazirmatn" w:cs="Vazirmatn"/>
-          <w:color w:val="17212B"/>
-          <w:szCs w:val="23"/>
-          <w:rtl/>
-          <w:lang w:val="fa-IR" w:bidi="fa-IR"/>
-        </w:rPr>
-        <w:t>طرح استارتاپی دانشگاهی برای توسعه بازی‌های مبتنی بر روان‌شناسی با هدف کمک به پیشگیری از جرم. این طرح به ثبت شرکت نرسید.</w:t>
-      </w:r>
-    </w:p>
-    <w:p>
-      <w:pPr>
-        <w:pStyle w:val="Heading1"/>
-        <w:bidi/>
-        <w:spacing w:before="180" w:after="100" w:line="405" w:lineRule="exact"/>
-      </w:pPr>
-      <w:r>
-        <w:rPr>
-          <w:rFonts w:ascii="Vazirmatn" w:eastAsia="Vazirmatn" w:hAnsi="Vazirmatn" w:cs="Vazirmatn"/>
-          <w:sz w:val="27"/>
-          <w:szCs w:val="27"/>
-          <w:rtl/>
-          <w:lang w:val="fa-IR" w:bidi="fa-IR"/>
-        </w:rPr>
         <w:t>زبان‌ها</w:t>
       </w:r>
     </w:p>
@@ -1192,6 +1302,9 @@
         <w:keepLines/>
         <w:bidi/>
         <w:spacing w:after="100" w:line="345" w:lineRule="exact"/>
+        <w:rPr>
+          <w:rFonts w:hint="eastAsia"/>
+        </w:rPr>
       </w:pPr>
       <w:r>
         <w:rPr>
@@ -1209,6 +1322,9 @@
         <w:keepLines/>
         <w:bidi/>
         <w:spacing w:after="100" w:line="310" w:lineRule="exact"/>
+        <w:rPr>
+          <w:rFonts w:hint="eastAsia"/>
+        </w:rPr>
       </w:pPr>
       <w:r>
         <w:rPr>
@@ -1237,6 +1353,9 @@
     <w:p>
       <w:pPr>
         <w:spacing w:after="0" w:line="240" w:lineRule="auto"/>
+        <w:rPr>
+          <w:rFonts w:hint="eastAsia"/>
+        </w:rPr>
       </w:pPr>
       <w:r>
         <w:separator/>
@@ -1247,6 +1366,9 @@
     <w:p>
       <w:pPr>
         <w:spacing w:after="0" w:line="240" w:lineRule="auto"/>
+        <w:rPr>
+          <w:rFonts w:hint="eastAsia"/>
+        </w:rPr>
       </w:pPr>
       <w:r>
         <w:continuationSeparator/>
@@ -1262,6 +1384,9 @@
     <w:pPr>
       <w:pStyle w:val="Footer"/>
       <w:jc w:val="center"/>
+      <w:rPr>
+        <w:rFonts w:hint="eastAsia"/>
+      </w:rPr>
     </w:pPr>
     <w:r>
       <w:rPr>
@@ -1280,6 +1405,9 @@
       <w:instrText>PAGE</w:instrText>
     </w:r>
     <w:r>
+      <w:rPr>
+        <w:rFonts w:hint="eastAsia"/>
+      </w:rPr>
       <w:fldChar w:fldCharType="separate"/>
     </w:r>
     <w:r>
@@ -1308,6 +1436,9 @@
       <w:instrText>NUMPAGES</w:instrText>
     </w:r>
     <w:r>
+      <w:rPr>
+        <w:rFonts w:hint="eastAsia"/>
+      </w:rPr>
       <w:fldChar w:fldCharType="separate"/>
     </w:r>
     <w:r>
@@ -1329,6 +1460,9 @@
     <w:p>
       <w:pPr>
         <w:spacing w:after="0" w:line="240" w:lineRule="auto"/>
+        <w:rPr>
+          <w:rFonts w:hint="eastAsia"/>
+        </w:rPr>
       </w:pPr>
       <w:r>
         <w:separator/>
@@ -1339,6 +1473,9 @@
     <w:p>
       <w:pPr>
         <w:spacing w:after="0" w:line="240" w:lineRule="auto"/>
+        <w:rPr>
+          <w:rFonts w:hint="eastAsia"/>
+        </w:rPr>
       </w:pPr>
       <w:r>
         <w:continuationSeparator/>
@@ -1521,31 +1658,31 @@
       </w:rPr>
     </w:lvl>
   </w:abstractNum>
-  <w:num w:numId="1" w16cid:durableId="1267541004">
+  <w:num w:numId="1" w16cid:durableId="39139091">
     <w:abstractNumId w:val="8"/>
   </w:num>
-  <w:num w:numId="2" w16cid:durableId="2057004954">
+  <w:num w:numId="2" w16cid:durableId="1418408369">
     <w:abstractNumId w:val="6"/>
   </w:num>
-  <w:num w:numId="3" w16cid:durableId="889848567">
+  <w:num w:numId="3" w16cid:durableId="539780133">
     <w:abstractNumId w:val="5"/>
   </w:num>
-  <w:num w:numId="4" w16cid:durableId="2137797203">
+  <w:num w:numId="4" w16cid:durableId="448475474">
     <w:abstractNumId w:val="4"/>
   </w:num>
-  <w:num w:numId="5" w16cid:durableId="1942905789">
+  <w:num w:numId="5" w16cid:durableId="1472553904">
     <w:abstractNumId w:val="7"/>
   </w:num>
-  <w:num w:numId="6" w16cid:durableId="7568404">
+  <w:num w:numId="6" w16cid:durableId="143544621">
     <w:abstractNumId w:val="3"/>
   </w:num>
-  <w:num w:numId="7" w16cid:durableId="1699312733">
+  <w:num w:numId="7" w16cid:durableId="557017882">
     <w:abstractNumId w:val="2"/>
   </w:num>
-  <w:num w:numId="8" w16cid:durableId="252472807">
+  <w:num w:numId="8" w16cid:durableId="172376058">
     <w:abstractNumId w:val="1"/>
   </w:num>
-  <w:num w:numId="9" w16cid:durableId="161510254">
+  <w:num w:numId="9" w16cid:durableId="345442224">
     <w:abstractNumId w:val="0"/>
   </w:num>
 </w:numbering>

</xml_diff>